<commit_message>
Cambio gitignore borrar informe viejo
</commit_message>
<xml_diff>
--- a/Practica5A/Informe_Practica_5A.docx
+++ b/Practica5A/Informe_Practica_5A.docx
@@ -4,18 +4,14 @@
   <w:body>
     <w:p>
       <w:pPr>
-        <w:pStyle w:val="Ttulo"/>
         <w:jc w:val="center"/>
       </w:pPr>
       <w:r>
-        <w:t>Práctica 5A</w:t>
-      </w:r>
-      <w:r>
-        <w:t xml:space="preserve"> - Javier Lamas</w:t>
-      </w:r>
-      <w:r>
-        <w:br/>
-        <w:t>Informe de pruebas</w:t>
+        <w:rPr>
+          <w:b/>
+          <w:sz w:val="32"/>
+        </w:rPr>
+        <w:t>Práctica 5A - Informe de pruebas</w:t>
       </w:r>
     </w:p>
     <w:p>
@@ -23,25 +19,50 @@
         <w:jc w:val="center"/>
       </w:pPr>
       <w:r>
+        <w:rPr>
+          <w:sz w:val="24"/>
+        </w:rPr>
         <w:t>Ingeniería del Software II</w:t>
       </w:r>
+    </w:p>
+    <w:p>
+      <w:pPr>
+        <w:jc w:val="center"/>
+      </w:pPr>
       <w:r>
-        <w:br/>
+        <w:rPr>
+          <w:sz w:val="24"/>
+        </w:rPr>
         <w:t>Proyecto SEGUROSNUEVO</w:t>
+      </w:r>
+    </w:p>
+    <w:p>
+      <w:pPr>
+        <w:jc w:val="center"/>
+      </w:pPr>
+      <w:r>
+        <w:rPr>
+          <w:sz w:val="22"/>
+        </w:rPr>
+        <w:t>Javier Lamas</w:t>
       </w:r>
     </w:p>
     <w:p/>
     <w:p>
       <w:pPr>
-        <w:pStyle w:val="Ttulo1"/>
+        <w:spacing w:before="160" w:after="80"/>
       </w:pPr>
       <w:r>
+        <w:rPr>
+          <w:b/>
+          <w:sz w:val="28"/>
+        </w:rPr>
         <w:t>1. Introducción</w:t>
       </w:r>
     </w:p>
     <w:p>
       <w:pPr>
-        <w:spacing w:after="120"/>
+        <w:spacing w:after="80" w:line="252" w:lineRule="auto"/>
       </w:pPr>
       <w:r>
         <w:t>En esta práctica se ha trabajado sobre una copia del proyecto de la práctica 3. El objetivo ha sido preparar y ejecutar pruebas unitarias y pruebas de integración sobre la aplicación de seguros.</w:t>
@@ -49,387 +70,1833 @@
     </w:p>
     <w:p>
       <w:pPr>
-        <w:spacing w:after="120"/>
+        <w:spacing w:after="80" w:line="252" w:lineRule="auto"/>
       </w:pPr>
       <w:r>
-        <w:t>Por una parte se han probado las clases del dominio Cliente y Seguro. Por otra parte se ha probado la clase VistaAgente junto con la capa de negocio y la capa de acceso a datos para el caso de uso de consulta de cliente.</w:t>
+        <w:t>Las pruebas unitarias se han centrado en las clases del dominio Cliente y Seguro, dejando fuera los métodos get y set. Las pruebas de integración se han centrado en la clase VistaAgente y en el caso de uso de consulta de cliente, comprobando la comunicación con la capa de negocio y la capa DAO.</w:t>
       </w:r>
     </w:p>
     <w:p>
       <w:pPr>
-        <w:spacing w:after="120"/>
+        <w:spacing w:after="80" w:line="252" w:lineRule="auto"/>
       </w:pPr>
       <w:r>
-        <w:t>La estructura general del proyecto se ha mantenido igual que en la práctica anterior, con los módulos SegurosCommon, SegurosBusiness, SegurosDAOH2, SegurosGUI y SegurosMain.</w:t>
+        <w:t>La estructura del proyecto se ha mantenido con los módulos SegurosCommon, SegurosBusiness, SegurosDAOH2, SegurosGUI y SegurosMain.</w:t>
       </w:r>
     </w:p>
     <w:p>
       <w:pPr>
-        <w:pStyle w:val="Ttulo1"/>
+        <w:spacing w:before="160" w:after="80"/>
       </w:pPr>
       <w:r>
-        <w:t>2. Ajustes hechos en Maven</w:t>
+        <w:rPr>
+          <w:b/>
+          <w:sz w:val="28"/>
+        </w:rPr>
+        <w:t>2. Preparación del proyecto y Maven</w:t>
       </w:r>
     </w:p>
     <w:p>
       <w:pPr>
-        <w:spacing w:after="120"/>
+        <w:spacing w:after="80" w:line="252" w:lineRule="auto"/>
       </w:pPr>
       <w:r>
-        <w:t>Antes de preparar las pruebas fue necesario revisar la configuración Maven del proyecto. Se corrigieron nombres de módulos para que todo quedara homogéneo y se añadieron las dependencias necesarias para pruebas.</w:t>
+        <w:t>Antes de preparar las pruebas se revisó la configuración Maven. Se añadieron las dependencias necesarias para JUnit 5 y AssertJ Swing, y se configuraron los plugins surefire y failsafe.</w:t>
       </w:r>
     </w:p>
     <w:p>
       <w:pPr>
-        <w:spacing w:after="120"/>
+        <w:spacing w:after="80" w:line="252" w:lineRule="auto"/>
       </w:pPr>
       <w:r>
-        <w:t>Para las pruebas unitarias se usó JUnit 5. Para la parte de interfaz se usó AssertJ Swing. Además se dejó configurado el plugin surefire para las pruebas unitarias y el plugin failsafe para las pruebas de integración.</w:t>
+        <w:t>Con esta configuración, las clases que acaban en Test se ejecutan con mvn test y las clases que acaban en IT se ejecutan con mvn verify. Esto es importante porque VistaAgenteIT es una prueba de integración y debe ejecutarse en la fase verify.</w:t>
+      </w:r>
+    </w:p>
+    <w:tbl>
+      <w:tblPr>
+        <w:tblStyle w:val="Tablaconcuadrcula"/>
+        <w:tblW w:w="0" w:type="auto"/>
+        <w:jc w:val="center"/>
+        <w:tblLook w:val="04A0" w:firstRow="1" w:lastRow="0" w:firstColumn="1" w:lastColumn="0" w:noHBand="0" w:noVBand="1"/>
+      </w:tblPr>
+      <w:tblGrid>
+        <w:gridCol w:w="2438"/>
+        <w:gridCol w:w="2268"/>
+        <w:gridCol w:w="3969"/>
+      </w:tblGrid>
+      <w:tr>
+        <w:trPr>
+          <w:jc w:val="center"/>
+        </w:trPr>
+        <w:tc>
+          <w:tcPr>
+            <w:tcW w:w="2438" w:type="dxa"/>
+            <w:shd w:val="clear" w:color="auto" w:fill="D9EAF7"/>
+            <w:vAlign w:val="center"/>
+          </w:tcPr>
+          <w:p>
+            <w:r>
+              <w:rPr>
+                <w:b/>
+                <w:sz w:val="18"/>
+              </w:rPr>
+              <w:t>Comprobación</w:t>
+            </w:r>
+          </w:p>
+        </w:tc>
+        <w:tc>
+          <w:tcPr>
+            <w:tcW w:w="2268" w:type="dxa"/>
+            <w:shd w:val="clear" w:color="auto" w:fill="D9EAF7"/>
+            <w:vAlign w:val="center"/>
+          </w:tcPr>
+          <w:p>
+            <w:r>
+              <w:rPr>
+                <w:b/>
+                <w:sz w:val="18"/>
+              </w:rPr>
+              <w:t>Comando usado</w:t>
+            </w:r>
+          </w:p>
+        </w:tc>
+        <w:tc>
+          <w:tcPr>
+            <w:tcW w:w="3969" w:type="dxa"/>
+            <w:shd w:val="clear" w:color="auto" w:fill="D9EAF7"/>
+            <w:vAlign w:val="center"/>
+          </w:tcPr>
+          <w:p>
+            <w:r>
+              <w:rPr>
+                <w:b/>
+                <w:sz w:val="18"/>
+              </w:rPr>
+              <w:t>Resultado esperado</w:t>
+            </w:r>
+          </w:p>
+        </w:tc>
+      </w:tr>
+      <w:tr>
+        <w:trPr>
+          <w:jc w:val="center"/>
+        </w:trPr>
+        <w:tc>
+          <w:tcPr>
+            <w:tcW w:w="2438" w:type="dxa"/>
+            <w:vAlign w:val="center"/>
+          </w:tcPr>
+          <w:p>
+            <w:r>
+              <w:rPr>
+                <w:sz w:val="18"/>
+              </w:rPr>
+              <w:t>Compilación y pruebas unitarias</w:t>
+            </w:r>
+          </w:p>
+        </w:tc>
+        <w:tc>
+          <w:tcPr>
+            <w:tcW w:w="2268" w:type="dxa"/>
+            <w:vAlign w:val="center"/>
+          </w:tcPr>
+          <w:p>
+            <w:r>
+              <w:rPr>
+                <w:sz w:val="18"/>
+              </w:rPr>
+              <w:t>mvn test</w:t>
+            </w:r>
+          </w:p>
+        </w:tc>
+        <w:tc>
+          <w:tcPr>
+            <w:tcW w:w="3969" w:type="dxa"/>
+            <w:vAlign w:val="center"/>
+          </w:tcPr>
+          <w:p>
+            <w:r>
+              <w:rPr>
+                <w:sz w:val="18"/>
+              </w:rPr>
+              <w:t>Ejecuta ClienteTest y SeguroTest</w:t>
+            </w:r>
+          </w:p>
+        </w:tc>
+      </w:tr>
+      <w:tr>
+        <w:trPr>
+          <w:jc w:val="center"/>
+        </w:trPr>
+        <w:tc>
+          <w:tcPr>
+            <w:tcW w:w="2438" w:type="dxa"/>
+            <w:vAlign w:val="center"/>
+          </w:tcPr>
+          <w:p>
+            <w:r>
+              <w:rPr>
+                <w:sz w:val="18"/>
+              </w:rPr>
+              <w:t>Pruebas de integración</w:t>
+            </w:r>
+          </w:p>
+        </w:tc>
+        <w:tc>
+          <w:tcPr>
+            <w:tcW w:w="2268" w:type="dxa"/>
+            <w:vAlign w:val="center"/>
+          </w:tcPr>
+          <w:p>
+            <w:r>
+              <w:rPr>
+                <w:sz w:val="18"/>
+              </w:rPr>
+              <w:t>mvn verify</w:t>
+            </w:r>
+          </w:p>
+        </w:tc>
+        <w:tc>
+          <w:tcPr>
+            <w:tcW w:w="3969" w:type="dxa"/>
+            <w:vAlign w:val="center"/>
+          </w:tcPr>
+          <w:p>
+            <w:r>
+              <w:rPr>
+                <w:sz w:val="18"/>
+              </w:rPr>
+              <w:t>Ejecuta VistaAgenteIT con failsafe</w:t>
+            </w:r>
+          </w:p>
+        </w:tc>
+      </w:tr>
+      <w:tr>
+        <w:trPr>
+          <w:jc w:val="center"/>
+        </w:trPr>
+        <w:tc>
+          <w:tcPr>
+            <w:tcW w:w="2438" w:type="dxa"/>
+            <w:vAlign w:val="center"/>
+          </w:tcPr>
+          <w:p>
+            <w:r>
+              <w:rPr>
+                <w:sz w:val="18"/>
+              </w:rPr>
+              <w:t>Ejecución en Eclipse</w:t>
+            </w:r>
+          </w:p>
+        </w:tc>
+        <w:tc>
+          <w:tcPr>
+            <w:tcW w:w="2268" w:type="dxa"/>
+            <w:vAlign w:val="center"/>
+          </w:tcPr>
+          <w:p>
+            <w:r>
+              <w:rPr>
+                <w:sz w:val="18"/>
+              </w:rPr>
+              <w:t>Run As / Coverage As</w:t>
+            </w:r>
+          </w:p>
+        </w:tc>
+        <w:tc>
+          <w:tcPr>
+            <w:tcW w:w="3969" w:type="dxa"/>
+            <w:vAlign w:val="center"/>
+          </w:tcPr>
+          <w:p>
+            <w:r>
+              <w:rPr>
+                <w:sz w:val="18"/>
+              </w:rPr>
+              <w:t>Permite comprobar resultados y cobertura</w:t>
+            </w:r>
+          </w:p>
+        </w:tc>
+      </w:tr>
+    </w:tbl>
+    <w:p/>
+    <w:p>
+      <w:pPr>
+        <w:spacing w:before="160" w:after="80"/>
+      </w:pPr>
+      <w:r>
+        <w:rPr>
+          <w:b/>
+          <w:sz w:val="28"/>
+        </w:rPr>
+        <w:t>3. Criterio seguido para diseñar las pruebas</w:t>
       </w:r>
     </w:p>
     <w:p>
       <w:pPr>
-        <w:spacing w:after="120"/>
+        <w:spacing w:after="80" w:line="252" w:lineRule="auto"/>
       </w:pPr>
       <w:r>
-        <w:t>Con esta configuración las clases que terminan en Test se ejecutan con mvn test y las clases que terminan en IT se ejecutan con mvn verify.</w:t>
+        <w:t>El diseño se ha hecho siguiendo primero caja negra y después caja blanca. En caja negra se han usado particiones de equivalencia y análisis de valores límite. Después, cuando los tests ya funcionaban, se comprobó la cobertura en Eclipse con EclEmma.</w:t>
       </w:r>
     </w:p>
     <w:p>
       <w:pPr>
-        <w:pStyle w:val="Ttulo1"/>
+        <w:spacing w:after="80" w:line="252" w:lineRule="auto"/>
       </w:pPr>
       <w:r>
-        <w:t>3. Pruebas unitarias de Cliente</w:t>
+        <w:t>La idea ha sido no meter casos al azar, sino elegir casos que representen situaciones distintas del programa. En Cliente se han separado los casos según número de seguros y minusvalía. En Seguro se han separado según fecha, cobertura y potencia. En VistaAgente se han separado según el resultado de la búsqueda del cliente.</w:t>
       </w:r>
     </w:p>
     <w:p>
       <w:pPr>
-        <w:spacing w:after="120"/>
+        <w:spacing w:before="160" w:after="80"/>
       </w:pPr>
       <w:r>
-        <w:t>En la clase Cliente se ha probado el método totalSeguros. Para diseñar los casos se ha partido de las situaciones más importantes que puede tener un cliente.</w:t>
+        <w:rPr>
+          <w:b/>
+          <w:sz w:val="28"/>
+        </w:rPr>
+        <w:t>4. Pruebas unitarias de Cliente</w:t>
       </w:r>
     </w:p>
     <w:p>
       <w:pPr>
-        <w:spacing w:after="120"/>
+        <w:spacing w:after="80" w:line="252" w:lineRule="auto"/>
       </w:pPr>
       <w:r>
-        <w:t>Primero se ha comprobado el caso de un cliente sin seguros. En ese caso el total debe ser 0.0. Después se ha probado un cliente con varios seguros y sin minusvalía, donde el resultado tiene que ser la suma directa de los precios. Por último se ha probado un cliente con varios seguros y con minusvalía, donde se aplica el descuento del 25 por ciento.</w:t>
+        <w:t>En Cliente se ha probado el método totalSeguros. Este método suma el precio de todos los seguros del cliente y, si el cliente tiene minusvalía, aplica un descuento del 25 por ciento sobre el total.</w:t>
       </w:r>
     </w:p>
     <w:p>
       <w:pPr>
-        <w:spacing w:after="120"/>
+        <w:spacing w:after="80" w:line="252" w:lineRule="auto"/>
       </w:pPr>
       <w:r>
-        <w:t>Para aislar esta prueba y no depender del cálculo real de Seguro, se ha usado un stub que devuelve precios fijos. Así la prueba se centra solo en comprobar la lógica de Cliente.</w:t>
+        <w:t>Para no mezclar esta prueba con el cálculo real de Seguro, se usó un stub de Seguro que devuelve precios fijos. Así la prueba se centra solo en la lógica de Cliente.</w:t>
+      </w:r>
+    </w:p>
+    <w:tbl>
+      <w:tblPr>
+        <w:tblStyle w:val="Tablaconcuadrcula"/>
+        <w:tblW w:w="0" w:type="auto"/>
+        <w:jc w:val="center"/>
+        <w:tblLook w:val="04A0" w:firstRow="1" w:lastRow="0" w:firstColumn="1" w:lastColumn="0" w:noHBand="0" w:noVBand="1"/>
+      </w:tblPr>
+      <w:tblGrid>
+        <w:gridCol w:w="2268"/>
+        <w:gridCol w:w="2268"/>
+        <w:gridCol w:w="2268"/>
+        <w:gridCol w:w="2551"/>
+      </w:tblGrid>
+      <w:tr>
+        <w:trPr>
+          <w:jc w:val="center"/>
+        </w:trPr>
+        <w:tc>
+          <w:tcPr>
+            <w:tcW w:w="2268" w:type="dxa"/>
+            <w:shd w:val="clear" w:color="auto" w:fill="D9EAF7"/>
+            <w:vAlign w:val="center"/>
+          </w:tcPr>
+          <w:p>
+            <w:r>
+              <w:rPr>
+                <w:b/>
+                <w:sz w:val="18"/>
+              </w:rPr>
+              <w:t>Entrada o situación</w:t>
+            </w:r>
+          </w:p>
+        </w:tc>
+        <w:tc>
+          <w:tcPr>
+            <w:tcW w:w="2268" w:type="dxa"/>
+            <w:shd w:val="clear" w:color="auto" w:fill="D9EAF7"/>
+            <w:vAlign w:val="center"/>
+          </w:tcPr>
+          <w:p>
+            <w:r>
+              <w:rPr>
+                <w:b/>
+                <w:sz w:val="18"/>
+              </w:rPr>
+              <w:t>Clase de equivalencia</w:t>
+            </w:r>
+          </w:p>
+        </w:tc>
+        <w:tc>
+          <w:tcPr>
+            <w:tcW w:w="2268" w:type="dxa"/>
+            <w:shd w:val="clear" w:color="auto" w:fill="D9EAF7"/>
+            <w:vAlign w:val="center"/>
+          </w:tcPr>
+          <w:p>
+            <w:r>
+              <w:rPr>
+                <w:b/>
+                <w:sz w:val="18"/>
+              </w:rPr>
+              <w:t>Valor usado</w:t>
+            </w:r>
+          </w:p>
+        </w:tc>
+        <w:tc>
+          <w:tcPr>
+            <w:tcW w:w="2551" w:type="dxa"/>
+            <w:shd w:val="clear" w:color="auto" w:fill="D9EAF7"/>
+            <w:vAlign w:val="center"/>
+          </w:tcPr>
+          <w:p>
+            <w:r>
+              <w:rPr>
+                <w:b/>
+                <w:sz w:val="18"/>
+              </w:rPr>
+              <w:t>Resultado esperado</w:t>
+            </w:r>
+          </w:p>
+        </w:tc>
+      </w:tr>
+      <w:tr>
+        <w:trPr>
+          <w:jc w:val="center"/>
+        </w:trPr>
+        <w:tc>
+          <w:tcPr>
+            <w:tcW w:w="2268" w:type="dxa"/>
+            <w:vAlign w:val="center"/>
+          </w:tcPr>
+          <w:p>
+            <w:r>
+              <w:rPr>
+                <w:sz w:val="18"/>
+              </w:rPr>
+              <w:t>Lista de seguros</w:t>
+            </w:r>
+          </w:p>
+        </w:tc>
+        <w:tc>
+          <w:tcPr>
+            <w:tcW w:w="2268" w:type="dxa"/>
+            <w:vAlign w:val="center"/>
+          </w:tcPr>
+          <w:p>
+            <w:r>
+              <w:rPr>
+                <w:sz w:val="18"/>
+              </w:rPr>
+              <w:t>Lista vacía</w:t>
+            </w:r>
+          </w:p>
+        </w:tc>
+        <w:tc>
+          <w:tcPr>
+            <w:tcW w:w="2268" w:type="dxa"/>
+            <w:vAlign w:val="center"/>
+          </w:tcPr>
+          <w:p>
+            <w:r>
+              <w:rPr>
+                <w:sz w:val="18"/>
+              </w:rPr>
+              <w:t>0 seguros</w:t>
+            </w:r>
+          </w:p>
+        </w:tc>
+        <w:tc>
+          <w:tcPr>
+            <w:tcW w:w="2551" w:type="dxa"/>
+            <w:vAlign w:val="center"/>
+          </w:tcPr>
+          <w:p>
+            <w:r>
+              <w:rPr>
+                <w:sz w:val="18"/>
+              </w:rPr>
+              <w:t>Total 0.0</w:t>
+            </w:r>
+          </w:p>
+        </w:tc>
+      </w:tr>
+      <w:tr>
+        <w:trPr>
+          <w:jc w:val="center"/>
+        </w:trPr>
+        <w:tc>
+          <w:tcPr>
+            <w:tcW w:w="2268" w:type="dxa"/>
+            <w:vAlign w:val="center"/>
+          </w:tcPr>
+          <w:p>
+            <w:r>
+              <w:rPr>
+                <w:sz w:val="18"/>
+              </w:rPr>
+              <w:t>Lista de seguros</w:t>
+            </w:r>
+          </w:p>
+        </w:tc>
+        <w:tc>
+          <w:tcPr>
+            <w:tcW w:w="2268" w:type="dxa"/>
+            <w:vAlign w:val="center"/>
+          </w:tcPr>
+          <w:p>
+            <w:r>
+              <w:rPr>
+                <w:sz w:val="18"/>
+              </w:rPr>
+              <w:t>Lista con varios elementos</w:t>
+            </w:r>
+          </w:p>
+        </w:tc>
+        <w:tc>
+          <w:tcPr>
+            <w:tcW w:w="2268" w:type="dxa"/>
+            <w:vAlign w:val="center"/>
+          </w:tcPr>
+          <w:p>
+            <w:r>
+              <w:rPr>
+                <w:sz w:val="18"/>
+              </w:rPr>
+              <w:t>100.0, 250.0 y 50.0</w:t>
+            </w:r>
+          </w:p>
+        </w:tc>
+        <w:tc>
+          <w:tcPr>
+            <w:tcW w:w="2551" w:type="dxa"/>
+            <w:vAlign w:val="center"/>
+          </w:tcPr>
+          <w:p>
+            <w:r>
+              <w:rPr>
+                <w:sz w:val="18"/>
+              </w:rPr>
+              <w:t>Suma 400.0</w:t>
+            </w:r>
+          </w:p>
+        </w:tc>
+      </w:tr>
+      <w:tr>
+        <w:trPr>
+          <w:jc w:val="center"/>
+        </w:trPr>
+        <w:tc>
+          <w:tcPr>
+            <w:tcW w:w="2268" w:type="dxa"/>
+            <w:vAlign w:val="center"/>
+          </w:tcPr>
+          <w:p>
+            <w:r>
+              <w:rPr>
+                <w:sz w:val="18"/>
+              </w:rPr>
+              <w:t>Minusvalía</w:t>
+            </w:r>
+          </w:p>
+        </w:tc>
+        <w:tc>
+          <w:tcPr>
+            <w:tcW w:w="2268" w:type="dxa"/>
+            <w:vAlign w:val="center"/>
+          </w:tcPr>
+          <w:p>
+            <w:r>
+              <w:rPr>
+                <w:sz w:val="18"/>
+              </w:rPr>
+              <w:t>Sin minusvalía</w:t>
+            </w:r>
+          </w:p>
+        </w:tc>
+        <w:tc>
+          <w:tcPr>
+            <w:tcW w:w="2268" w:type="dxa"/>
+            <w:vAlign w:val="center"/>
+          </w:tcPr>
+          <w:p>
+            <w:r>
+              <w:rPr>
+                <w:sz w:val="18"/>
+              </w:rPr>
+              <w:t>false</w:t>
+            </w:r>
+          </w:p>
+        </w:tc>
+        <w:tc>
+          <w:tcPr>
+            <w:tcW w:w="2551" w:type="dxa"/>
+            <w:vAlign w:val="center"/>
+          </w:tcPr>
+          <w:p>
+            <w:r>
+              <w:rPr>
+                <w:sz w:val="18"/>
+              </w:rPr>
+              <w:t>Sin descuento</w:t>
+            </w:r>
+          </w:p>
+        </w:tc>
+      </w:tr>
+      <w:tr>
+        <w:trPr>
+          <w:jc w:val="center"/>
+        </w:trPr>
+        <w:tc>
+          <w:tcPr>
+            <w:tcW w:w="2268" w:type="dxa"/>
+            <w:vAlign w:val="center"/>
+          </w:tcPr>
+          <w:p>
+            <w:r>
+              <w:rPr>
+                <w:sz w:val="18"/>
+              </w:rPr>
+              <w:lastRenderedPageBreak/>
+              <w:t>Minusvalía</w:t>
+            </w:r>
+          </w:p>
+        </w:tc>
+        <w:tc>
+          <w:tcPr>
+            <w:tcW w:w="2268" w:type="dxa"/>
+            <w:vAlign w:val="center"/>
+          </w:tcPr>
+          <w:p>
+            <w:r>
+              <w:rPr>
+                <w:sz w:val="18"/>
+              </w:rPr>
+              <w:t>Con minusvalía</w:t>
+            </w:r>
+          </w:p>
+        </w:tc>
+        <w:tc>
+          <w:tcPr>
+            <w:tcW w:w="2268" w:type="dxa"/>
+            <w:vAlign w:val="center"/>
+          </w:tcPr>
+          <w:p>
+            <w:r>
+              <w:rPr>
+                <w:sz w:val="18"/>
+              </w:rPr>
+              <w:t>true</w:t>
+            </w:r>
+          </w:p>
+        </w:tc>
+        <w:tc>
+          <w:tcPr>
+            <w:tcW w:w="2551" w:type="dxa"/>
+            <w:vAlign w:val="center"/>
+          </w:tcPr>
+          <w:p>
+            <w:r>
+              <w:rPr>
+                <w:sz w:val="18"/>
+              </w:rPr>
+              <w:t>Descuento del 25 por ciento</w:t>
+            </w:r>
+          </w:p>
+        </w:tc>
+      </w:tr>
+    </w:tbl>
+    <w:p/>
+    <w:tbl>
+      <w:tblPr>
+        <w:tblStyle w:val="Tablaconcuadrcula"/>
+        <w:tblW w:w="0" w:type="auto"/>
+        <w:jc w:val="center"/>
+        <w:tblLook w:val="04A0" w:firstRow="1" w:lastRow="0" w:firstColumn="1" w:lastColumn="0" w:noHBand="0" w:noVBand="1"/>
+      </w:tblPr>
+      <w:tblGrid>
+        <w:gridCol w:w="3253"/>
+        <w:gridCol w:w="3515"/>
+        <w:gridCol w:w="2041"/>
+      </w:tblGrid>
+      <w:tr>
+        <w:trPr>
+          <w:jc w:val="center"/>
+        </w:trPr>
+        <w:tc>
+          <w:tcPr>
+            <w:tcW w:w="3118" w:type="dxa"/>
+            <w:shd w:val="clear" w:color="auto" w:fill="D9EAF7"/>
+            <w:vAlign w:val="center"/>
+          </w:tcPr>
+          <w:p>
+            <w:r>
+              <w:rPr>
+                <w:b/>
+                <w:sz w:val="18"/>
+              </w:rPr>
+              <w:t>Test</w:t>
+            </w:r>
+          </w:p>
+        </w:tc>
+        <w:tc>
+          <w:tcPr>
+            <w:tcW w:w="3515" w:type="dxa"/>
+            <w:shd w:val="clear" w:color="auto" w:fill="D9EAF7"/>
+            <w:vAlign w:val="center"/>
+          </w:tcPr>
+          <w:p>
+            <w:r>
+              <w:rPr>
+                <w:b/>
+                <w:sz w:val="18"/>
+              </w:rPr>
+              <w:t>Qué comprueba</w:t>
+            </w:r>
+          </w:p>
+        </w:tc>
+        <w:tc>
+          <w:tcPr>
+            <w:tcW w:w="2041" w:type="dxa"/>
+            <w:shd w:val="clear" w:color="auto" w:fill="D9EAF7"/>
+            <w:vAlign w:val="center"/>
+          </w:tcPr>
+          <w:p>
+            <w:r>
+              <w:rPr>
+                <w:b/>
+                <w:sz w:val="18"/>
+              </w:rPr>
+              <w:t>Resultado esperado</w:t>
+            </w:r>
+          </w:p>
+        </w:tc>
+      </w:tr>
+      <w:tr>
+        <w:trPr>
+          <w:jc w:val="center"/>
+        </w:trPr>
+        <w:tc>
+          <w:tcPr>
+            <w:tcW w:w="3118" w:type="dxa"/>
+            <w:vAlign w:val="center"/>
+          </w:tcPr>
+          <w:p>
+            <w:r>
+              <w:rPr>
+                <w:sz w:val="18"/>
+              </w:rPr>
+              <w:t>totalSegurosListaVaciaSinMinusvalia</w:t>
+            </w:r>
+          </w:p>
+        </w:tc>
+        <w:tc>
+          <w:tcPr>
+            <w:tcW w:w="3515" w:type="dxa"/>
+            <w:vAlign w:val="center"/>
+          </w:tcPr>
+          <w:p>
+            <w:r>
+              <w:rPr>
+                <w:sz w:val="18"/>
+              </w:rPr>
+              <w:t>Cliente sin seguros</w:t>
+            </w:r>
+          </w:p>
+        </w:tc>
+        <w:tc>
+          <w:tcPr>
+            <w:tcW w:w="2041" w:type="dxa"/>
+            <w:vAlign w:val="center"/>
+          </w:tcPr>
+          <w:p>
+            <w:r>
+              <w:rPr>
+                <w:sz w:val="18"/>
+              </w:rPr>
+              <w:t>0.0</w:t>
+            </w:r>
+          </w:p>
+        </w:tc>
+      </w:tr>
+      <w:tr>
+        <w:trPr>
+          <w:jc w:val="center"/>
+        </w:trPr>
+        <w:tc>
+          <w:tcPr>
+            <w:tcW w:w="3118" w:type="dxa"/>
+            <w:vAlign w:val="center"/>
+          </w:tcPr>
+          <w:p>
+            <w:r>
+              <w:rPr>
+                <w:sz w:val="18"/>
+              </w:rPr>
+              <w:t>totalSegurosVariosSegurosSinMinusvalia</w:t>
+            </w:r>
+          </w:p>
+        </w:tc>
+        <w:tc>
+          <w:tcPr>
+            <w:tcW w:w="3515" w:type="dxa"/>
+            <w:vAlign w:val="center"/>
+          </w:tcPr>
+          <w:p>
+            <w:r>
+              <w:rPr>
+                <w:sz w:val="18"/>
+              </w:rPr>
+              <w:t>Varios seguros sin descuento</w:t>
+            </w:r>
+          </w:p>
+        </w:tc>
+        <w:tc>
+          <w:tcPr>
+            <w:tcW w:w="2041" w:type="dxa"/>
+            <w:vAlign w:val="center"/>
+          </w:tcPr>
+          <w:p>
+            <w:r>
+              <w:rPr>
+                <w:sz w:val="18"/>
+              </w:rPr>
+              <w:t>400.0</w:t>
+            </w:r>
+          </w:p>
+        </w:tc>
+      </w:tr>
+      <w:tr>
+        <w:trPr>
+          <w:jc w:val="center"/>
+        </w:trPr>
+        <w:tc>
+          <w:tcPr>
+            <w:tcW w:w="3118" w:type="dxa"/>
+            <w:vAlign w:val="center"/>
+          </w:tcPr>
+          <w:p>
+            <w:r>
+              <w:rPr>
+                <w:sz w:val="18"/>
+              </w:rPr>
+              <w:t>totalSegurosVariosSegurosConMinusvalia</w:t>
+            </w:r>
+          </w:p>
+        </w:tc>
+        <w:tc>
+          <w:tcPr>
+            <w:tcW w:w="3515" w:type="dxa"/>
+            <w:vAlign w:val="center"/>
+          </w:tcPr>
+          <w:p>
+            <w:r>
+              <w:rPr>
+                <w:sz w:val="18"/>
+              </w:rPr>
+              <w:t>Varios seguros con descuento por minusvalía</w:t>
+            </w:r>
+          </w:p>
+        </w:tc>
+        <w:tc>
+          <w:tcPr>
+            <w:tcW w:w="2041" w:type="dxa"/>
+            <w:vAlign w:val="center"/>
+          </w:tcPr>
+          <w:p>
+            <w:r>
+              <w:rPr>
+                <w:sz w:val="18"/>
+              </w:rPr>
+              <w:t>300.0</w:t>
+            </w:r>
+          </w:p>
+        </w:tc>
+      </w:tr>
+    </w:tbl>
+    <w:p/>
+    <w:p>
+      <w:pPr>
+        <w:spacing w:after="80" w:line="252" w:lineRule="auto"/>
+      </w:pPr>
+      <w:r>
+        <w:t>Después de ejecutar las pruebas de caja negra se revisó la cobertura. En Eclipse se ejecutó ClienteTest con cobertura y el resultado fue 3 pruebas ejecutadas de 3, sin errores ni fallos. Con estos casos se cubre el bucle con cero iteraciones y con varias iteraciones, y también las dos ramas de la decisión de minusvalía. Por eso no fue necesario añadir más casos solo para caja blanca.</w:t>
       </w:r>
     </w:p>
     <w:p>
       <w:pPr>
-        <w:spacing w:after="120"/>
+        <w:spacing w:before="160" w:after="80"/>
       </w:pPr>
       <w:r>
-        <w:lastRenderedPageBreak/>
-        <w:t>Los casos implementados han sido los siguientes. Caso 1, lista vacía y sin minusvalía, resultado esperado 0.0. Caso 2, varios seguros sin minusvalía, resultado esperado 400.0. Caso 3, varios seguros con minusvalía, resultado esperado 300.0.</w:t>
+        <w:rPr>
+          <w:b/>
+          <w:sz w:val="28"/>
+        </w:rPr>
+        <w:t>5. Pruebas unitarias de Seguro</w:t>
       </w:r>
     </w:p>
     <w:p>
       <w:pPr>
-        <w:spacing w:after="120"/>
+        <w:spacing w:after="80" w:line="252" w:lineRule="auto"/>
       </w:pPr>
       <w:r>
-        <w:t>Con estos casos se recorren las dos ramas importantes del método, es decir, cuando hay descuento por minusvalía y cuando no lo hay. También se cubre el recorrido del bucle con cero iteraciones y con varias iteraciones.</w:t>
+        <w:t>En Seguro se ha probado el método precio. Este método depende de tres factores principales: si el seguro ya está vigente, el tipo de cobertura y la potencia del coche. Además aplica un descuento si el seguro lleva menos de un año activo.</w:t>
+      </w:r>
+    </w:p>
+    <w:tbl>
+      <w:tblPr>
+        <w:tblStyle w:val="Tablaconcuadrcula"/>
+        <w:tblW w:w="0" w:type="auto"/>
+        <w:jc w:val="center"/>
+        <w:tblLook w:val="04A0" w:firstRow="1" w:lastRow="0" w:firstColumn="1" w:lastColumn="0" w:noHBand="0" w:noVBand="1"/>
+      </w:tblPr>
+      <w:tblGrid>
+        <w:gridCol w:w="1984"/>
+        <w:gridCol w:w="3969"/>
+        <w:gridCol w:w="2835"/>
+      </w:tblGrid>
+      <w:tr>
+        <w:trPr>
+          <w:jc w:val="center"/>
+        </w:trPr>
+        <w:tc>
+          <w:tcPr>
+            <w:tcW w:w="1984" w:type="dxa"/>
+            <w:shd w:val="clear" w:color="auto" w:fill="D9EAF7"/>
+            <w:vAlign w:val="center"/>
+          </w:tcPr>
+          <w:p>
+            <w:r>
+              <w:rPr>
+                <w:b/>
+                <w:sz w:val="18"/>
+              </w:rPr>
+              <w:t>Factor</w:t>
+            </w:r>
+          </w:p>
+        </w:tc>
+        <w:tc>
+          <w:tcPr>
+            <w:tcW w:w="3969" w:type="dxa"/>
+            <w:shd w:val="clear" w:color="auto" w:fill="D9EAF7"/>
+            <w:vAlign w:val="center"/>
+          </w:tcPr>
+          <w:p>
+            <w:r>
+              <w:rPr>
+                <w:b/>
+                <w:sz w:val="18"/>
+              </w:rPr>
+              <w:t>Particiones y límites usados</w:t>
+            </w:r>
+          </w:p>
+        </w:tc>
+        <w:tc>
+          <w:tcPr>
+            <w:tcW w:w="2835" w:type="dxa"/>
+            <w:shd w:val="clear" w:color="auto" w:fill="D9EAF7"/>
+            <w:vAlign w:val="center"/>
+          </w:tcPr>
+          <w:p>
+            <w:r>
+              <w:rPr>
+                <w:b/>
+                <w:sz w:val="18"/>
+              </w:rPr>
+              <w:t>Motivo</w:t>
+            </w:r>
+          </w:p>
+        </w:tc>
+      </w:tr>
+      <w:tr>
+        <w:trPr>
+          <w:jc w:val="center"/>
+        </w:trPr>
+        <w:tc>
+          <w:tcPr>
+            <w:tcW w:w="1984" w:type="dxa"/>
+            <w:vAlign w:val="center"/>
+          </w:tcPr>
+          <w:p>
+            <w:r>
+              <w:rPr>
+                <w:sz w:val="18"/>
+              </w:rPr>
+              <w:t>Fecha de inicio</w:t>
+            </w:r>
+          </w:p>
+        </w:tc>
+        <w:tc>
+          <w:tcPr>
+            <w:tcW w:w="3969" w:type="dxa"/>
+            <w:vAlign w:val="center"/>
+          </w:tcPr>
+          <w:p>
+            <w:r>
+              <w:rPr>
+                <w:sz w:val="18"/>
+              </w:rPr>
+              <w:t>Fecha futura, fecha dentro del primer año, fecha con un año exacto y fecha antigua</w:t>
+            </w:r>
+          </w:p>
+        </w:tc>
+        <w:tc>
+          <w:tcPr>
+            <w:tcW w:w="2835" w:type="dxa"/>
+            <w:vAlign w:val="center"/>
+          </w:tcPr>
+          <w:p>
+            <w:r>
+              <w:rPr>
+                <w:sz w:val="18"/>
+              </w:rPr>
+              <w:t>Comprueba seguro no vigente y descuento por antigüedad</w:t>
+            </w:r>
+          </w:p>
+        </w:tc>
+      </w:tr>
+      <w:tr>
+        <w:trPr>
+          <w:jc w:val="center"/>
+        </w:trPr>
+        <w:tc>
+          <w:tcPr>
+            <w:tcW w:w="1984" w:type="dxa"/>
+            <w:vAlign w:val="center"/>
+          </w:tcPr>
+          <w:p>
+            <w:r>
+              <w:rPr>
+                <w:sz w:val="18"/>
+              </w:rPr>
+              <w:t>Cobertura</w:t>
+            </w:r>
+          </w:p>
+        </w:tc>
+        <w:tc>
+          <w:tcPr>
+            <w:tcW w:w="3969" w:type="dxa"/>
+            <w:vAlign w:val="center"/>
+          </w:tcPr>
+          <w:p>
+            <w:r>
+              <w:rPr>
+                <w:sz w:val="18"/>
+              </w:rPr>
+              <w:t>TERCEROS, TERCEROS_LUNAS y TODO_RIESGO</w:t>
+            </w:r>
+          </w:p>
+        </w:tc>
+        <w:tc>
+          <w:tcPr>
+            <w:tcW w:w="2835" w:type="dxa"/>
+            <w:vAlign w:val="center"/>
+          </w:tcPr>
+          <w:p>
+            <w:r>
+              <w:rPr>
+                <w:sz w:val="18"/>
+              </w:rPr>
+              <w:t>Cada cobertura tiene un precio base distinto</w:t>
+            </w:r>
+          </w:p>
+        </w:tc>
+      </w:tr>
+      <w:tr>
+        <w:trPr>
+          <w:jc w:val="center"/>
+        </w:trPr>
+        <w:tc>
+          <w:tcPr>
+            <w:tcW w:w="1984" w:type="dxa"/>
+            <w:vAlign w:val="center"/>
+          </w:tcPr>
+          <w:p>
+            <w:r>
+              <w:rPr>
+                <w:sz w:val="18"/>
+              </w:rPr>
+              <w:t>Potencia</w:t>
+            </w:r>
+          </w:p>
+        </w:tc>
+        <w:tc>
+          <w:tcPr>
+            <w:tcW w:w="3969" w:type="dxa"/>
+            <w:vAlign w:val="center"/>
+          </w:tcPr>
+          <w:p>
+            <w:r>
+              <w:rPr>
+                <w:sz w:val="18"/>
+              </w:rPr>
+              <w:t>89, 90, 110 y 111</w:t>
+            </w:r>
+          </w:p>
+        </w:tc>
+        <w:tc>
+          <w:tcPr>
+            <w:tcW w:w="2835" w:type="dxa"/>
+            <w:vAlign w:val="center"/>
+          </w:tcPr>
+          <w:p>
+            <w:r>
+              <w:rPr>
+                <w:sz w:val="18"/>
+              </w:rPr>
+              <w:t>Cubre el límite inferior, el límite superior y el tramo alto</w:t>
+            </w:r>
+          </w:p>
+        </w:tc>
+      </w:tr>
+    </w:tbl>
+    <w:p/>
+    <w:tbl>
+      <w:tblPr>
+        <w:tblStyle w:val="Tablaconcuadrcula"/>
+        <w:tblW w:w="0" w:type="auto"/>
+        <w:jc w:val="center"/>
+        <w:tblLook w:val="04A0" w:firstRow="1" w:lastRow="0" w:firstColumn="1" w:lastColumn="0" w:noHBand="0" w:noVBand="1"/>
+      </w:tblPr>
+      <w:tblGrid>
+        <w:gridCol w:w="4392"/>
+        <w:gridCol w:w="3628"/>
+        <w:gridCol w:w="1701"/>
+      </w:tblGrid>
+      <w:tr>
+        <w:trPr>
+          <w:jc w:val="center"/>
+        </w:trPr>
+        <w:tc>
+          <w:tcPr>
+            <w:tcW w:w="3402" w:type="dxa"/>
+            <w:shd w:val="clear" w:color="auto" w:fill="D9EAF7"/>
+            <w:vAlign w:val="center"/>
+          </w:tcPr>
+          <w:p>
+            <w:r>
+              <w:rPr>
+                <w:b/>
+                <w:sz w:val="18"/>
+              </w:rPr>
+              <w:t>Test</w:t>
+            </w:r>
+          </w:p>
+        </w:tc>
+        <w:tc>
+          <w:tcPr>
+            <w:tcW w:w="3628" w:type="dxa"/>
+            <w:shd w:val="clear" w:color="auto" w:fill="D9EAF7"/>
+            <w:vAlign w:val="center"/>
+          </w:tcPr>
+          <w:p>
+            <w:r>
+              <w:rPr>
+                <w:b/>
+                <w:sz w:val="18"/>
+              </w:rPr>
+              <w:t>Caso probado</w:t>
+            </w:r>
+          </w:p>
+        </w:tc>
+        <w:tc>
+          <w:tcPr>
+            <w:tcW w:w="1701" w:type="dxa"/>
+            <w:shd w:val="clear" w:color="auto" w:fill="D9EAF7"/>
+            <w:vAlign w:val="center"/>
+          </w:tcPr>
+          <w:p>
+            <w:r>
+              <w:rPr>
+                <w:b/>
+                <w:sz w:val="18"/>
+              </w:rPr>
+              <w:t>Resultado esperado</w:t>
+            </w:r>
+          </w:p>
+        </w:tc>
+      </w:tr>
+      <w:tr>
+        <w:trPr>
+          <w:jc w:val="center"/>
+        </w:trPr>
+        <w:tc>
+          <w:tcPr>
+            <w:tcW w:w="3402" w:type="dxa"/>
+            <w:vAlign w:val="center"/>
+          </w:tcPr>
+          <w:p>
+            <w:r>
+              <w:rPr>
+                <w:sz w:val="18"/>
+              </w:rPr>
+              <w:t>precioSeguroNoVigente</w:t>
+            </w:r>
+          </w:p>
+        </w:tc>
+        <w:tc>
+          <w:tcPr>
+            <w:tcW w:w="3628" w:type="dxa"/>
+            <w:vAlign w:val="center"/>
+          </w:tcPr>
+          <w:p>
+            <w:r>
+              <w:rPr>
+                <w:sz w:val="18"/>
+              </w:rPr>
+              <w:t>Fecha futura</w:t>
+            </w:r>
+          </w:p>
+        </w:tc>
+        <w:tc>
+          <w:tcPr>
+            <w:tcW w:w="1701" w:type="dxa"/>
+            <w:vAlign w:val="center"/>
+          </w:tcPr>
+          <w:p>
+            <w:r>
+              <w:rPr>
+                <w:sz w:val="18"/>
+              </w:rPr>
+              <w:t>0.0</w:t>
+            </w:r>
+          </w:p>
+        </w:tc>
+      </w:tr>
+      <w:tr>
+        <w:trPr>
+          <w:jc w:val="center"/>
+        </w:trPr>
+        <w:tc>
+          <w:tcPr>
+            <w:tcW w:w="3402" w:type="dxa"/>
+            <w:vAlign w:val="center"/>
+          </w:tcPr>
+          <w:p>
+            <w:r>
+              <w:rPr>
+                <w:sz w:val="18"/>
+              </w:rPr>
+              <w:t>precioTercerosSinRecargosNiDescuentos</w:t>
+            </w:r>
+          </w:p>
+        </w:tc>
+        <w:tc>
+          <w:tcPr>
+            <w:tcW w:w="3628" w:type="dxa"/>
+            <w:vAlign w:val="center"/>
+          </w:tcPr>
+          <w:p>
+            <w:r>
+              <w:rPr>
+                <w:sz w:val="18"/>
+              </w:rPr>
+              <w:t>TERCEROS con potencia 89</w:t>
+            </w:r>
+          </w:p>
+        </w:tc>
+        <w:tc>
+          <w:tcPr>
+            <w:tcW w:w="1701" w:type="dxa"/>
+            <w:vAlign w:val="center"/>
+          </w:tcPr>
+          <w:p>
+            <w:r>
+              <w:rPr>
+                <w:sz w:val="18"/>
+              </w:rPr>
+              <w:t>400.0</w:t>
+            </w:r>
+          </w:p>
+        </w:tc>
+      </w:tr>
+      <w:tr>
+        <w:trPr>
+          <w:jc w:val="center"/>
+        </w:trPr>
+        <w:tc>
+          <w:tcPr>
+            <w:tcW w:w="3402" w:type="dxa"/>
+            <w:vAlign w:val="center"/>
+          </w:tcPr>
+          <w:p>
+            <w:r>
+              <w:rPr>
+                <w:sz w:val="18"/>
+              </w:rPr>
+              <w:t>precioTercerosPotenciaLimiteInferiorTramoMedio</w:t>
+            </w:r>
+          </w:p>
+        </w:tc>
+        <w:tc>
+          <w:tcPr>
+            <w:tcW w:w="3628" w:type="dxa"/>
+            <w:vAlign w:val="center"/>
+          </w:tcPr>
+          <w:p>
+            <w:r>
+              <w:rPr>
+                <w:sz w:val="18"/>
+              </w:rPr>
+              <w:t>TERCEROS con potencia 90</w:t>
+            </w:r>
+          </w:p>
+        </w:tc>
+        <w:tc>
+          <w:tcPr>
+            <w:tcW w:w="1701" w:type="dxa"/>
+            <w:vAlign w:val="center"/>
+          </w:tcPr>
+          <w:p>
+            <w:r>
+              <w:rPr>
+                <w:sz w:val="18"/>
+              </w:rPr>
+              <w:t>420.0</w:t>
+            </w:r>
+          </w:p>
+        </w:tc>
+      </w:tr>
+      <w:tr>
+        <w:trPr>
+          <w:jc w:val="center"/>
+        </w:trPr>
+        <w:tc>
+          <w:tcPr>
+            <w:tcW w:w="3402" w:type="dxa"/>
+            <w:vAlign w:val="center"/>
+          </w:tcPr>
+          <w:p>
+            <w:r>
+              <w:rPr>
+                <w:sz w:val="18"/>
+              </w:rPr>
+              <w:t>precioTercerosLunasPotenciaLimiteSuperiorTramoMedio</w:t>
+            </w:r>
+          </w:p>
+        </w:tc>
+        <w:tc>
+          <w:tcPr>
+            <w:tcW w:w="3628" w:type="dxa"/>
+            <w:vAlign w:val="center"/>
+          </w:tcPr>
+          <w:p>
+            <w:r>
+              <w:rPr>
+                <w:sz w:val="18"/>
+              </w:rPr>
+              <w:t>TERCEROS_LUNAS con potencia 110</w:t>
+            </w:r>
+          </w:p>
+        </w:tc>
+        <w:tc>
+          <w:tcPr>
+            <w:tcW w:w="1701" w:type="dxa"/>
+            <w:vAlign w:val="center"/>
+          </w:tcPr>
+          <w:p>
+            <w:r>
+              <w:rPr>
+                <w:sz w:val="18"/>
+              </w:rPr>
+              <w:t>630.0</w:t>
+            </w:r>
+          </w:p>
+        </w:tc>
+      </w:tr>
+      <w:tr>
+        <w:trPr>
+          <w:jc w:val="center"/>
+        </w:trPr>
+        <w:tc>
+          <w:tcPr>
+            <w:tcW w:w="3402" w:type="dxa"/>
+            <w:vAlign w:val="center"/>
+          </w:tcPr>
+          <w:p>
+            <w:r>
+              <w:rPr>
+                <w:sz w:val="18"/>
+              </w:rPr>
+              <w:t>precioTercerosLunasPotenciaSuperiorTramoAlto</w:t>
+            </w:r>
+          </w:p>
+        </w:tc>
+        <w:tc>
+          <w:tcPr>
+            <w:tcW w:w="3628" w:type="dxa"/>
+            <w:vAlign w:val="center"/>
+          </w:tcPr>
+          <w:p>
+            <w:r>
+              <w:rPr>
+                <w:sz w:val="18"/>
+              </w:rPr>
+              <w:t>TERCEROS_LUNAS con potencia 111</w:t>
+            </w:r>
+          </w:p>
+        </w:tc>
+        <w:tc>
+          <w:tcPr>
+            <w:tcW w:w="1701" w:type="dxa"/>
+            <w:vAlign w:val="center"/>
+          </w:tcPr>
+          <w:p>
+            <w:r>
+              <w:rPr>
+                <w:sz w:val="18"/>
+              </w:rPr>
+              <w:t>720.0</w:t>
+            </w:r>
+          </w:p>
+        </w:tc>
+      </w:tr>
+      <w:tr>
+        <w:trPr>
+          <w:jc w:val="center"/>
+        </w:trPr>
+        <w:tc>
+          <w:tcPr>
+            <w:tcW w:w="3402" w:type="dxa"/>
+            <w:vAlign w:val="center"/>
+          </w:tcPr>
+          <w:p>
+            <w:r>
+              <w:rPr>
+                <w:sz w:val="18"/>
+              </w:rPr>
+              <w:t>precioTodoRiesgoDurantePrimerAnio</w:t>
+            </w:r>
+          </w:p>
+        </w:tc>
+        <w:tc>
+          <w:tcPr>
+            <w:tcW w:w="3628" w:type="dxa"/>
+            <w:vAlign w:val="center"/>
+          </w:tcPr>
+          <w:p>
+            <w:r>
+              <w:rPr>
+                <w:sz w:val="18"/>
+              </w:rPr>
+              <w:t>TODO_RIESGO durante el primer año</w:t>
+            </w:r>
+          </w:p>
+        </w:tc>
+        <w:tc>
+          <w:tcPr>
+            <w:tcW w:w="1701" w:type="dxa"/>
+            <w:vAlign w:val="center"/>
+          </w:tcPr>
+          <w:p>
+            <w:r>
+              <w:rPr>
+                <w:sz w:val="18"/>
+              </w:rPr>
+              <w:t>800.0</w:t>
+            </w:r>
+          </w:p>
+        </w:tc>
+      </w:tr>
+      <w:tr>
+        <w:trPr>
+          <w:jc w:val="center"/>
+        </w:trPr>
+        <w:tc>
+          <w:tcPr>
+            <w:tcW w:w="3402" w:type="dxa"/>
+            <w:vAlign w:val="center"/>
+          </w:tcPr>
+          <w:p>
+            <w:r>
+              <w:rPr>
+                <w:sz w:val="18"/>
+              </w:rPr>
+              <w:t>precioExactamenteUnAnioDeAntiguedadSinDescuento</w:t>
+            </w:r>
+          </w:p>
+        </w:tc>
+        <w:tc>
+          <w:tcPr>
+            <w:tcW w:w="3628" w:type="dxa"/>
+            <w:vAlign w:val="center"/>
+          </w:tcPr>
+          <w:p>
+            <w:r>
+              <w:rPr>
+                <w:sz w:val="18"/>
+              </w:rPr>
+              <w:t>Un año exacto de antigüedad</w:t>
+            </w:r>
+          </w:p>
+        </w:tc>
+        <w:tc>
+          <w:tcPr>
+            <w:tcW w:w="1701" w:type="dxa"/>
+            <w:vAlign w:val="center"/>
+          </w:tcPr>
+          <w:p>
+            <w:r>
+              <w:rPr>
+                <w:sz w:val="18"/>
+              </w:rPr>
+              <w:t>400.0</w:t>
+            </w:r>
+          </w:p>
+        </w:tc>
+      </w:tr>
+    </w:tbl>
+    <w:p/>
+    <w:p>
+      <w:pPr>
+        <w:spacing w:after="80" w:line="252" w:lineRule="auto"/>
+      </w:pPr>
+      <w:r>
+        <w:t>Después de ejecutar las pruebas se comprobó la cobertura con EclEmma. En la captura de Eclipse aparece SeguroTest con 7 pruebas ejecutadas de 7, sin errores ni fallos. También se ve que las zonas del método cubiertas por estos tests aparecen en verde. Los casos elegidos cubren la salida temprana por fecha futura, las tres ramas de cobertura, los límites de potencia y las dos posibilidades del descuento por antigüedad. Por eso, igual que en Cliente, no hizo falta añadir más casos después de revisar la cobertura.</w:t>
       </w:r>
     </w:p>
     <w:p>
       <w:pPr>
-        <w:spacing w:after="120"/>
+        <w:spacing w:before="160" w:after="80"/>
       </w:pPr>
       <w:r>
-        <w:drawing>
-          <wp:inline distT="0" distB="0" distL="0" distR="0" wp14:anchorId="2765D93C" wp14:editId="094B8886">
-            <wp:extent cx="3627434" cy="3779848"/>
-            <wp:effectExtent l="0" t="0" r="0" b="0"/>
-            <wp:docPr id="277209339" name="Imagen 1"/>
-            <wp:cNvGraphicFramePr>
-              <a:graphicFrameLocks xmlns:a="http://schemas.openxmlformats.org/drawingml/2006/main" noChangeAspect="1"/>
-            </wp:cNvGraphicFramePr>
-            <a:graphic xmlns:a="http://schemas.openxmlformats.org/drawingml/2006/main">
-              <a:graphicData uri="http://schemas.openxmlformats.org/drawingml/2006/picture">
-                <pic:pic xmlns:pic="http://schemas.openxmlformats.org/drawingml/2006/picture">
-                  <pic:nvPicPr>
-                    <pic:cNvPr id="277209339" name=""/>
-                    <pic:cNvPicPr/>
-                  </pic:nvPicPr>
-                  <pic:blipFill>
-                    <a:blip r:embed="rId6"/>
-                    <a:stretch>
-                      <a:fillRect/>
-                    </a:stretch>
-                  </pic:blipFill>
-                  <pic:spPr>
-                    <a:xfrm>
-                      <a:off x="0" y="0"/>
-                      <a:ext cx="3627434" cy="3779848"/>
-                    </a:xfrm>
-                    <a:prstGeom prst="rect">
-                      <a:avLst/>
-                    </a:prstGeom>
-                  </pic:spPr>
-                </pic:pic>
-              </a:graphicData>
-            </a:graphic>
-          </wp:inline>
-        </w:drawing>
+        <w:rPr>
+          <w:b/>
+          <w:sz w:val="28"/>
+        </w:rPr>
+        <w:t>6. Pruebas de integración de VistaAgente</w:t>
       </w:r>
     </w:p>
     <w:p>
       <w:pPr>
-        <w:pStyle w:val="Ttulo1"/>
+        <w:spacing w:after="80" w:line="252" w:lineRule="auto"/>
       </w:pPr>
       <w:r>
-        <w:t>4. Pruebas unitarias de Seguro</w:t>
+        <w:t>La prueba de integración se ha hecho sobre VistaAgente. Aquí no se prueba una clase aislada, sino el funcionamiento conjunto de la ventana, GestionSeguros, ClientesDAO, SegurosDAO y la base de datos H2 en memoria.</w:t>
       </w:r>
     </w:p>
     <w:p>
       <w:pPr>
-        <w:spacing w:after="120"/>
+        <w:spacing w:after="80" w:line="252" w:lineRule="auto"/>
       </w:pPr>
       <w:r>
-        <w:t>En la clase Seguro se ha probado el método precio. Aquí se han tenido en cuenta tres factores que afectan al resultado final: la fecha de inicio, el tipo de cobertura y la potencia del vehículo.</w:t>
+        <w:t>Para que AssertJ Swing pudiera localizar los elementos de la interfaz se asignaron nombres a los componentes principales. Se nombraron el campo del DNI, el campo del nombre, el campo del total, el botón de buscar, la lista de seguros y la propia ventana.</w:t>
+      </w:r>
+    </w:p>
+    <w:tbl>
+      <w:tblPr>
+        <w:tblStyle w:val="Tablaconcuadrcula"/>
+        <w:tblW w:w="0" w:type="auto"/>
+        <w:jc w:val="center"/>
+        <w:tblLook w:val="04A0" w:firstRow="1" w:lastRow="0" w:firstColumn="1" w:lastColumn="0" w:noHBand="0" w:noVBand="1"/>
+      </w:tblPr>
+      <w:tblGrid>
+        <w:gridCol w:w="2948"/>
+        <w:gridCol w:w="2948"/>
+        <w:gridCol w:w="3061"/>
+      </w:tblGrid>
+      <w:tr>
+        <w:trPr>
+          <w:jc w:val="center"/>
+        </w:trPr>
+        <w:tc>
+          <w:tcPr>
+            <w:tcW w:w="2948" w:type="dxa"/>
+            <w:shd w:val="clear" w:color="auto" w:fill="D9EAF7"/>
+            <w:vAlign w:val="center"/>
+          </w:tcPr>
+          <w:p>
+            <w:r>
+              <w:rPr>
+                <w:b/>
+                <w:sz w:val="18"/>
+              </w:rPr>
+              <w:t>Caso</w:t>
+            </w:r>
+          </w:p>
+        </w:tc>
+        <w:tc>
+          <w:tcPr>
+            <w:tcW w:w="2948" w:type="dxa"/>
+            <w:shd w:val="clear" w:color="auto" w:fill="D9EAF7"/>
+            <w:vAlign w:val="center"/>
+          </w:tcPr>
+          <w:p>
+            <w:r>
+              <w:rPr>
+                <w:b/>
+                <w:sz w:val="18"/>
+              </w:rPr>
+              <w:t>DNI o situación</w:t>
+            </w:r>
+          </w:p>
+        </w:tc>
+        <w:tc>
+          <w:tcPr>
+            <w:tcW w:w="3061" w:type="dxa"/>
+            <w:shd w:val="clear" w:color="auto" w:fill="D9EAF7"/>
+            <w:vAlign w:val="center"/>
+          </w:tcPr>
+          <w:p>
+            <w:r>
+              <w:rPr>
+                <w:b/>
+                <w:sz w:val="18"/>
+              </w:rPr>
+              <w:t>Salida esperada</w:t>
+            </w:r>
+          </w:p>
+        </w:tc>
+      </w:tr>
+      <w:tr>
+        <w:trPr>
+          <w:jc w:val="center"/>
+        </w:trPr>
+        <w:tc>
+          <w:tcPr>
+            <w:tcW w:w="2948" w:type="dxa"/>
+            <w:vAlign w:val="center"/>
+          </w:tcPr>
+          <w:p>
+            <w:r>
+              <w:rPr>
+                <w:sz w:val="18"/>
+              </w:rPr>
+              <w:t>Cliente existente con varios seguros</w:t>
+            </w:r>
+          </w:p>
+        </w:tc>
+        <w:tc>
+          <w:tcPr>
+            <w:tcW w:w="2948" w:type="dxa"/>
+            <w:vAlign w:val="center"/>
+          </w:tcPr>
+          <w:p>
+            <w:r>
+              <w:rPr>
+                <w:sz w:val="18"/>
+              </w:rPr>
+              <w:t>11111111A</w:t>
+            </w:r>
+          </w:p>
+        </w:tc>
+        <w:tc>
+          <w:tcPr>
+            <w:tcW w:w="3061" w:type="dxa"/>
+            <w:vAlign w:val="center"/>
+          </w:tcPr>
+          <w:p>
+            <w:r>
+              <w:rPr>
+                <w:sz w:val="18"/>
+              </w:rPr>
+              <w:t>Nombre Juan, total 1820.0 y tres seguros</w:t>
+            </w:r>
+          </w:p>
+        </w:tc>
+      </w:tr>
+      <w:tr>
+        <w:trPr>
+          <w:jc w:val="center"/>
+        </w:trPr>
+        <w:tc>
+          <w:tcPr>
+            <w:tcW w:w="2948" w:type="dxa"/>
+            <w:vAlign w:val="center"/>
+          </w:tcPr>
+          <w:p>
+            <w:r>
+              <w:rPr>
+                <w:sz w:val="18"/>
+              </w:rPr>
+              <w:t>Cliente existente sin seguros</w:t>
+            </w:r>
+          </w:p>
+        </w:tc>
+        <w:tc>
+          <w:tcPr>
+            <w:tcW w:w="2948" w:type="dxa"/>
+            <w:vAlign w:val="center"/>
+          </w:tcPr>
+          <w:p>
+            <w:r>
+              <w:rPr>
+                <w:sz w:val="18"/>
+              </w:rPr>
+              <w:t>33333333A</w:t>
+            </w:r>
+          </w:p>
+        </w:tc>
+        <w:tc>
+          <w:tcPr>
+            <w:tcW w:w="3061" w:type="dxa"/>
+            <w:vAlign w:val="center"/>
+          </w:tcPr>
+          <w:p>
+            <w:r>
+              <w:rPr>
+                <w:sz w:val="18"/>
+              </w:rPr>
+              <w:t>Nombre Luis, total 0.0 y lista vacía</w:t>
+            </w:r>
+          </w:p>
+        </w:tc>
+      </w:tr>
+      <w:tr>
+        <w:trPr>
+          <w:jc w:val="center"/>
+        </w:trPr>
+        <w:tc>
+          <w:tcPr>
+            <w:tcW w:w="2948" w:type="dxa"/>
+            <w:vAlign w:val="center"/>
+          </w:tcPr>
+          <w:p>
+            <w:r>
+              <w:rPr>
+                <w:sz w:val="18"/>
+              </w:rPr>
+              <w:lastRenderedPageBreak/>
+              <w:t>Cliente inexistente</w:t>
+            </w:r>
+          </w:p>
+        </w:tc>
+        <w:tc>
+          <w:tcPr>
+            <w:tcW w:w="2948" w:type="dxa"/>
+            <w:vAlign w:val="center"/>
+          </w:tcPr>
+          <w:p>
+            <w:r>
+              <w:rPr>
+                <w:sz w:val="18"/>
+              </w:rPr>
+              <w:t>99999999Z</w:t>
+            </w:r>
+          </w:p>
+        </w:tc>
+        <w:tc>
+          <w:tcPr>
+            <w:tcW w:w="3061" w:type="dxa"/>
+            <w:vAlign w:val="center"/>
+          </w:tcPr>
+          <w:p>
+            <w:r>
+              <w:rPr>
+                <w:sz w:val="18"/>
+              </w:rPr>
+              <w:t>Texto DNI No Válido, total vacío y lista vacía</w:t>
+            </w:r>
+          </w:p>
+        </w:tc>
+      </w:tr>
+      <w:tr>
+        <w:trPr>
+          <w:jc w:val="center"/>
+        </w:trPr>
+        <w:tc>
+          <w:tcPr>
+            <w:tcW w:w="2948" w:type="dxa"/>
+            <w:vAlign w:val="center"/>
+          </w:tcPr>
+          <w:p>
+            <w:r>
+              <w:rPr>
+                <w:sz w:val="18"/>
+              </w:rPr>
+              <w:t>Error de acceso a datos</w:t>
+            </w:r>
+          </w:p>
+        </w:tc>
+        <w:tc>
+          <w:tcPr>
+            <w:tcW w:w="2948" w:type="dxa"/>
+            <w:vAlign w:val="center"/>
+          </w:tcPr>
+          <w:p>
+            <w:r>
+              <w:rPr>
+                <w:sz w:val="18"/>
+              </w:rPr>
+              <w:t>DAO simulado que lanza DataAccessException</w:t>
+            </w:r>
+          </w:p>
+        </w:tc>
+        <w:tc>
+          <w:tcPr>
+            <w:tcW w:w="3061" w:type="dxa"/>
+            <w:vAlign w:val="center"/>
+          </w:tcPr>
+          <w:p>
+            <w:r>
+              <w:rPr>
+                <w:sz w:val="18"/>
+              </w:rPr>
+              <w:t>Texto Error BBDD, total vacío y lista vacía</w:t>
+            </w:r>
+          </w:p>
+        </w:tc>
+      </w:tr>
+    </w:tbl>
+    <w:p/>
+    <w:p>
+      <w:pPr>
+        <w:spacing w:after="80" w:line="252" w:lineRule="auto"/>
+      </w:pPr>
+      <w:r>
+        <w:t>Estos casos cubren las tres salidas importantes de la vista: cliente encontrado, cliente no encontrado y error de acceso a datos. También se comprueba la lista de seguros en dos situaciones, con varios elementos y vacía.</w:t>
       </w:r>
     </w:p>
     <w:p>
       <w:pPr>
-        <w:spacing w:after="120"/>
+        <w:spacing w:after="80" w:line="252" w:lineRule="auto"/>
       </w:pPr>
       <w:r>
-        <w:t>El primer caso comprobado ha sido el de un seguro que todavía no está vigente. Si la fecha de inicio es futura, el método debe devolver 0.0. Después se han probado los tres tipos de cobertura disponibles: terceros, terceros lunas y todo riesgo.</w:t>
+        <w:t>La clase de prueba se llama VistaAgenteIT para diferenciarla de las unitarias. Se ejecuta con Maven en verify mediante el plugin failsafe. Después de corregir la interacción con la interfaz, la prueba de integración queda preparada para ejecutarse junto con el resto del proyecto mediante mvn verify.</w:t>
       </w:r>
     </w:p>
     <w:p>
       <w:pPr>
-        <w:spacing w:after="120"/>
+        <w:spacing w:after="80" w:line="252" w:lineRule="auto"/>
       </w:pPr>
       <w:r>
-        <w:t>También se han probado los tramos de potencia. Se ha incluido un valor por debajo de 90, los límites 90 y 110, y un valor por encima de 110. Además se ha comprobado el descuento del 20 por ciento cuando el seguro lleva menos de un año activo y el caso exacto de un año, donde ya no se aplica ese descuento.</w:t>
+        <w:t xml:space="preserve">En cuanto a cobertura, los casos de integración cubren las ramas principales de rellenaDatosCliente: cliente distinto de null, cliente null y DataAccessException. También ejercitan el llenado de la lista de seguros y el borrado de datos </w:t>
+      </w:r>
+      <w:proofErr w:type="spellStart"/>
+      <w:r>
+        <w:t>cuando</w:t>
+      </w:r>
+      <w:proofErr w:type="spellEnd"/>
+      <w:r>
+        <w:t xml:space="preserve"> no hay </w:t>
+      </w:r>
+      <w:proofErr w:type="spellStart"/>
+      <w:r>
+        <w:t>resultados</w:t>
+      </w:r>
+      <w:proofErr w:type="spellEnd"/>
+      <w:r>
+        <w:t>.</w:t>
       </w:r>
     </w:p>
     <w:p>
       <w:pPr>
-        <w:spacing w:after="120"/>
+        <w:spacing w:after="80" w:line="252" w:lineRule="auto"/>
       </w:pPr>
-      <w:r>
-        <w:t xml:space="preserve">Los casos preparados han sido estos. Caso 1, terceros, potencia 15 y fecha futura, resultado 0.0. Caso 2, terceros, potencia 89 y fecha antigua, resultado 400.0. Caso 3, terceros, potencia 90 y fecha antigua, resultado 420.0. Caso 4, terceros lunas, potencia 110 y fecha antigua, resultado 630.0. Caso 5, terceros lunas, potencia 111 y fecha antigua, resultado 720.0. Caso 6, todo riesgo, potencia 20 y fecha dentro del </w:t>
-      </w:r>
-      <w:r>
-        <w:lastRenderedPageBreak/>
-        <w:t>primer año, resultado 800.0. Caso 7, terceros, potencia 15 y fecha de hace exactamente un año, resultado 400.0.</w:t>
-      </w:r>
     </w:p>
     <w:p>
       <w:pPr>
-        <w:spacing w:after="120"/>
+        <w:spacing w:after="80" w:line="252" w:lineRule="auto"/>
       </w:pPr>
-      <w:r>
-        <w:t>Con este conjunto se recorren todas las decisiones importantes del método. Se comprueba la salida temprana cuando el seguro aún no está en vigor, las tres ramas del cálculo según cobertura, los dos recargos por potencia y las dos posibilidades del descuento por antigüedad.</w:t>
-      </w:r>
     </w:p>
     <w:p>
       <w:pPr>
-        <w:spacing w:after="120"/>
+        <w:spacing w:after="80" w:line="252" w:lineRule="auto"/>
       </w:pPr>
       <w:r>
+        <w:rPr>
+          <w:noProof/>
+        </w:rPr>
         <w:drawing>
-          <wp:inline distT="0" distB="0" distL="0" distR="0" wp14:anchorId="1290D0FF" wp14:editId="58AE7C95">
-            <wp:extent cx="3741744" cy="3924640"/>
-            <wp:effectExtent l="0" t="0" r="0" b="0"/>
-            <wp:docPr id="1816373717" name="Imagen 1"/>
-            <wp:cNvGraphicFramePr>
-              <a:graphicFrameLocks xmlns:a="http://schemas.openxmlformats.org/drawingml/2006/main" noChangeAspect="1"/>
-            </wp:cNvGraphicFramePr>
-            <a:graphic xmlns:a="http://schemas.openxmlformats.org/drawingml/2006/main">
-              <a:graphicData uri="http://schemas.openxmlformats.org/drawingml/2006/picture">
-                <pic:pic xmlns:pic="http://schemas.openxmlformats.org/drawingml/2006/picture">
-                  <pic:nvPicPr>
-                    <pic:cNvPr id="1816373717" name=""/>
-                    <pic:cNvPicPr/>
-                  </pic:nvPicPr>
-                  <pic:blipFill>
-                    <a:blip r:embed="rId7"/>
-                    <a:stretch>
-                      <a:fillRect/>
-                    </a:stretch>
-                  </pic:blipFill>
-                  <pic:spPr>
-                    <a:xfrm>
-                      <a:off x="0" y="0"/>
-                      <a:ext cx="3741744" cy="3924640"/>
-                    </a:xfrm>
-                    <a:prstGeom prst="rect">
-                      <a:avLst/>
-                    </a:prstGeom>
-                  </pic:spPr>
-                </pic:pic>
-              </a:graphicData>
-            </a:graphic>
-          </wp:inline>
-        </w:drawing>
-      </w:r>
-    </w:p>
-    <w:p>
-      <w:pPr>
-        <w:pStyle w:val="Ttulo1"/>
-      </w:pPr>
-      <w:r>
-        <w:t>5. Pruebas de integración de VistaAgente</w:t>
-      </w:r>
-    </w:p>
-    <w:p>
-      <w:pPr>
-        <w:spacing w:after="120"/>
-      </w:pPr>
-      <w:r>
-        <w:t>La prueba de integración se ha hecho sobre la clase VistaAgente. Aquí ya no se prueba una clase aislada, sino el funcionamiento conjunto de la interfaz, la lógica de negocio, la capa DAO y la base de datos H2 en memoria.</w:t>
-      </w:r>
-    </w:p>
-    <w:p>
-      <w:pPr>
-        <w:spacing w:after="120"/>
-      </w:pPr>
-      <w:r>
-        <w:t>Para poder automatizar la interfaz se asignaron nombres a los componentes más importantes de la ventana. En concreto se nombraron el campo del DNI, el campo del nombre, el campo del total, el botón de buscar, la lista de seguros y la propia ventana.</w:t>
-      </w:r>
-    </w:p>
-    <w:p>
-      <w:pPr>
-        <w:spacing w:after="120"/>
-      </w:pPr>
-      <w:r>
-        <w:t>Se prepararon cuatro casos de integración. El primero consulta el cliente 11111111A, que existe y tiene varios seguros. Se espera que aparezca el nombre Juan, el total 1820.0 y tres seguros en la lista. El segundo consulta el cliente 33333333A, que existe pero no tiene seguros. Se espera que aparezca el nombre Luis, el total 0.0 y la lista vacía.</w:t>
-      </w:r>
-    </w:p>
-    <w:p>
-      <w:pPr>
-        <w:spacing w:after="120"/>
-      </w:pPr>
-      <w:r>
-        <w:t xml:space="preserve">El tercer caso comprueba un DNI que no está registrado. En ese caso la interfaz debe mostrar DNI No Válido, dejar el total vacío y no mostrar seguros. El cuarto caso fuerza un error de acceso a datos para </w:t>
-      </w:r>
-      <w:r>
-        <w:lastRenderedPageBreak/>
-        <w:t>comprobar la rama de tratamiento de errores. En esa situación la interfaz debe mostrar Error BBDD, dejar el total vacío y vaciar la lista.</w:t>
-      </w:r>
-    </w:p>
-    <w:p>
-      <w:pPr>
-        <w:spacing w:after="120"/>
-      </w:pPr>
-      <w:r>
-        <w:t>Estos casos permiten comprobar que la búsqueda de clientes funciona bien tanto en situaciones normales como en situaciones de error.</w:t>
-      </w:r>
-    </w:p>
-    <w:p>
-      <w:pPr>
-        <w:spacing w:after="120"/>
-      </w:pPr>
-      <w:r>
-        <w:drawing>
-          <wp:inline distT="0" distB="0" distL="0" distR="0" wp14:anchorId="0E11765C" wp14:editId="0C589155">
-            <wp:extent cx="5972810" cy="1795780"/>
-            <wp:effectExtent l="0" t="0" r="8890" b="0"/>
-            <wp:docPr id="1489177974" name="Imagen 1"/>
-            <wp:cNvGraphicFramePr>
-              <a:graphicFrameLocks xmlns:a="http://schemas.openxmlformats.org/drawingml/2006/main" noChangeAspect="1"/>
-            </wp:cNvGraphicFramePr>
-            <a:graphic xmlns:a="http://schemas.openxmlformats.org/drawingml/2006/main">
-              <a:graphicData uri="http://schemas.openxmlformats.org/drawingml/2006/picture">
-                <pic:pic xmlns:pic="http://schemas.openxmlformats.org/drawingml/2006/picture">
-                  <pic:nvPicPr>
-                    <pic:cNvPr id="1489177974" name=""/>
-                    <pic:cNvPicPr/>
-                  </pic:nvPicPr>
-                  <pic:blipFill>
-                    <a:blip r:embed="rId8"/>
-                    <a:stretch>
-                      <a:fillRect/>
-                    </a:stretch>
-                  </pic:blipFill>
-                  <pic:spPr>
-                    <a:xfrm>
-                      <a:off x="0" y="0"/>
-                      <a:ext cx="5972810" cy="1795780"/>
-                    </a:xfrm>
-                    <a:prstGeom prst="rect">
-                      <a:avLst/>
-                    </a:prstGeom>
-                  </pic:spPr>
-                </pic:pic>
-              </a:graphicData>
-            </a:graphic>
-          </wp:inline>
-        </w:drawing>
-      </w:r>
-    </w:p>
-    <w:p>
-      <w:pPr>
-        <w:pStyle w:val="Ttulo1"/>
-      </w:pPr>
-      <w:r>
-        <w:t>6. Archivos de prueba incluidos</w:t>
-      </w:r>
-    </w:p>
-    <w:p>
-      <w:pPr>
-        <w:spacing w:after="120"/>
-      </w:pPr>
-      <w:r>
-        <w:t>Las pruebas unitarias están en SegurosCommon, dentro de las clases ClienteTest y SeguroTest. La prueba de integración está en SegurosGUI, dentro de la clase VistaAgenteIT.</w:t>
-      </w:r>
-    </w:p>
-    <w:p>
-      <w:pPr>
-        <w:spacing w:after="120"/>
-      </w:pPr>
-      <w:r>
-        <w:t>Además he creado una Main para desplegar VistaAgente y poder probar la interfa manualmente.</w:t>
-      </w:r>
-    </w:p>
-    <w:p>
-      <w:pPr>
-        <w:pStyle w:val="Ttulo1"/>
-      </w:pPr>
-      <w:r>
-        <w:t>7. Ejecución</w:t>
-      </w:r>
-    </w:p>
-    <w:p>
-      <w:pPr>
-        <w:spacing w:after="120"/>
-      </w:pPr>
-      <w:r>
-        <w:t>Para ejecutar las pruebas desde la raíz del proyecto hay que usar dos comandos. El primero es mvn test, que lanza las pruebas unitarias. El segundo es mvn verify, que además ejecuta la prueba de integración.</w:t>
-      </w:r>
-    </w:p>
-    <w:p>
-      <w:pPr>
-        <w:spacing w:after="120"/>
-      </w:pPr>
-      <w:r>
-        <w:t>En Eclipse también se pueden lanzar las clases de prueba de forma individual una vez que el proyecto esté importado como proyecto Maven y se hayan actualizado las dependencias.</w:t>
-      </w:r>
-    </w:p>
-    <w:p>
-      <w:pPr>
-        <w:spacing w:after="120"/>
-      </w:pPr>
-      <w:r>
-        <w:lastRenderedPageBreak/>
-        <w:drawing>
-          <wp:inline distT="0" distB="0" distL="0" distR="0" wp14:anchorId="437C96AB" wp14:editId="1DACE9CD">
+          <wp:inline distT="0" distB="0" distL="0" distR="0" wp14:anchorId="0061D875" wp14:editId="44B9A19F">
             <wp:extent cx="5464013" cy="3337849"/>
             <wp:effectExtent l="0" t="0" r="3810" b="0"/>
             <wp:docPr id="663953163" name="Imagen 1"/>
@@ -444,7 +1911,7 @@
                     <pic:cNvPicPr/>
                   </pic:nvPicPr>
                   <pic:blipFill>
-                    <a:blip r:embed="rId9"/>
+                    <a:blip r:embed="rId6"/>
                     <a:stretch>
                       <a:fillRect/>
                     </a:stretch>
@@ -467,87 +1934,112 @@
     </w:p>
     <w:p>
       <w:pPr>
-        <w:pStyle w:val="Ttulo1"/>
-      </w:pPr>
-      <w:r>
-        <w:t>8.Problemas</w:t>
-      </w:r>
-    </w:p>
-    <w:p>
-      <w:pPr>
-        <w:spacing w:after="120"/>
+        <w:spacing w:before="160" w:after="80"/>
         <w:rPr>
-          <w:lang w:val="es-ES"/>
-        </w:rPr>
-      </w:pPr>
-      <w:r>
-        <w:rPr>
-          <w:lang w:val="es-ES"/>
-        </w:rPr>
-        <w:t>Durante el desarrollo de las pruebas de integración de la clase VistaAgente surgieron dificultades al ejecutar los tests con AssertJ Swing, ya que, aunque la aplicación funcionaba correctamente al probarla manualmente, los tests fallaban porque los campos de la interfaz no se actualizaban como se esperaba. Inicialmente se pensó que el problema estaba en la lógica de la vista o en la capa de negocio, pero se comprobó que el error estaba en la forma en la que el test interactuaba con la interfaz gráfica. En concreto, el uso de métodos como enterText y click no garantizaba que los eventos de Swing se ejecutasen correctamente en el hilo adecuado (EDT), por lo que las acciones no se reflejaban en la interfaz en el momento de la comprobación. Finalmente, se solucionó ejecutando las interacciones directamente sobre los componentes mediante GuiActionRunner y utilizando métodos como setText y doClick, asegurando así que las acciones se realizasen en el hilo correcto y que los cambios en la interfaz se aplicasen antes de realizar las aserciones.</w:t>
-      </w:r>
-    </w:p>
-    <w:p>
-      <w:pPr>
-        <w:spacing w:after="120"/>
-        <w:rPr>
-          <w:lang w:val="es-ES"/>
+          <w:b/>
+          <w:sz w:val="28"/>
         </w:rPr>
       </w:pPr>
     </w:p>
     <w:p>
       <w:pPr>
-        <w:pStyle w:val="Ttulo1"/>
+        <w:spacing w:before="160" w:after="80"/>
+        <w:rPr>
+          <w:b/>
+          <w:sz w:val="28"/>
+        </w:rPr>
+      </w:pPr>
+    </w:p>
+    <w:p>
+      <w:pPr>
+        <w:spacing w:before="160" w:after="80"/>
+        <w:rPr>
+          <w:b/>
+          <w:sz w:val="28"/>
+        </w:rPr>
+      </w:pPr>
+    </w:p>
+    <w:p>
+      <w:pPr>
+        <w:spacing w:before="160" w:after="80"/>
+        <w:rPr>
+          <w:b/>
+          <w:sz w:val="28"/>
+        </w:rPr>
+      </w:pPr>
+    </w:p>
+    <w:p>
+      <w:pPr>
+        <w:spacing w:before="160" w:after="80"/>
+        <w:rPr>
+          <w:b/>
+          <w:sz w:val="28"/>
+        </w:rPr>
+      </w:pPr>
+    </w:p>
+    <w:p>
+      <w:pPr>
+        <w:spacing w:before="160" w:after="80"/>
+        <w:rPr>
+          <w:b/>
+          <w:sz w:val="28"/>
+        </w:rPr>
+      </w:pPr>
+    </w:p>
+    <w:p>
+      <w:pPr>
+        <w:spacing w:before="160" w:after="80"/>
+        <w:rPr>
+          <w:b/>
+          <w:sz w:val="28"/>
+        </w:rPr>
+      </w:pPr>
+    </w:p>
+    <w:p>
+      <w:pPr>
+        <w:spacing w:before="160" w:after="80"/>
       </w:pPr>
       <w:r>
-        <w:t>9</w:t>
-      </w:r>
-      <w:r>
-        <w:t>. Conclusión</w:t>
+        <w:rPr>
+          <w:b/>
+          <w:sz w:val="28"/>
+        </w:rPr>
+        <w:lastRenderedPageBreak/>
+        <w:t>7. Resultados de ejecución y cobertura</w:t>
       </w:r>
     </w:p>
     <w:p>
       <w:pPr>
-        <w:spacing w:after="120"/>
+        <w:spacing w:after="80" w:line="252" w:lineRule="auto"/>
       </w:pPr>
       <w:r>
-        <w:t>En resumen, en esta práctica se ha dejado preparado un conjunto de pruebas suficiente para revisar tanto el comportamiento interno de las clases del dominio como la integración de la interfaz con el resto de capas. Las pruebas unitarias se han centrado en cubrir los casos normales y los límites más importantes. Las pruebas de integración se han centrado en el caso de uso de consulta de cliente y en la respuesta de la interfaz ante datos válidos, datos inexistentes y errores de acceso.</w:t>
+        <w:t>Los resultados revisados en Eclipse fueron correctos para las pruebas unitarias. ClienteTest terminó con 3 pruebas de 3, sin errores ni fallos. SeguroTest terminó con 7 pruebas de 7, sin errores ni fallos. Además, al lanzar Coverage As JUnit Test se comprobó visualmente que las partes principales de los métodos probados quedaban ejecutadas.</w:t>
       </w:r>
     </w:p>
     <w:p>
       <w:pPr>
-        <w:spacing w:after="120"/>
+        <w:jc w:val="center"/>
       </w:pPr>
       <w:r>
-        <w:lastRenderedPageBreak/>
-        <w:t>El resultado final es un proyecto más fácil de comprobar y mantener, ya que cualquier cambio posterior se puede validar de forma rápida usando Maven y las clases de prueba añadidas.</w:t>
+        <w:rPr>
+          <w:sz w:val="18"/>
+        </w:rPr>
+        <w:t>Captura de comprobación de cobertura y ejecución de SeguroTest en Eclipse.</w:t>
       </w:r>
     </w:p>
     <w:p>
       <w:pPr>
-        <w:spacing w:after="120"/>
-      </w:pPr>
-    </w:p>
-    <w:p>
-      <w:pPr>
-        <w:pStyle w:val="Ttulo1"/>
+        <w:jc w:val="center"/>
       </w:pPr>
       <w:r>
-        <w:t>10. Git</w:t>
-      </w:r>
-    </w:p>
-    <w:p>
-      <w:r>
-        <w:t>He creado nueva rama, “commiteado” los cambios, actualizado el repositorio y fusionado con la rama principal.</w:t>
-      </w:r>
-    </w:p>
-    <w:p>
-      <w:r>
+        <w:rPr>
+          <w:noProof/>
+        </w:rPr>
         <w:drawing>
-          <wp:inline distT="0" distB="0" distL="0" distR="0" wp14:anchorId="3C799BD2" wp14:editId="58AD2532">
-            <wp:extent cx="5972810" cy="5710555"/>
-            <wp:effectExtent l="0" t="0" r="8890" b="4445"/>
-            <wp:docPr id="1549924322" name="Imagen 1"/>
+          <wp:inline distT="0" distB="0" distL="0" distR="0" wp14:anchorId="5D219766" wp14:editId="6CB9FDE4">
+            <wp:extent cx="4297680" cy="4206793"/>
+            <wp:effectExtent l="0" t="0" r="0" b="0"/>
+            <wp:docPr id="1" name="Picture 1"/>
             <wp:cNvGraphicFramePr>
               <a:graphicFrameLocks xmlns:a="http://schemas.openxmlformats.org/drawingml/2006/main" noChangeAspect="1"/>
             </wp:cNvGraphicFramePr>
@@ -555,11 +2047,11 @@
               <a:graphicData uri="http://schemas.openxmlformats.org/drawingml/2006/picture">
                 <pic:pic xmlns:pic="http://schemas.openxmlformats.org/drawingml/2006/picture">
                   <pic:nvPicPr>
-                    <pic:cNvPr id="1549924322" name=""/>
+                    <pic:cNvPr id="0" name="image.png"/>
                     <pic:cNvPicPr/>
                   </pic:nvPicPr>
                   <pic:blipFill>
-                    <a:blip r:embed="rId10"/>
+                    <a:blip r:embed="rId7"/>
                     <a:stretch>
                       <a:fillRect/>
                     </a:stretch>
@@ -567,7 +2059,7 @@
                   <pic:spPr>
                     <a:xfrm>
                       <a:off x="0" y="0"/>
-                      <a:ext cx="5972810" cy="5710555"/>
+                      <a:ext cx="4297680" cy="4206793"/>
                     </a:xfrm>
                     <a:prstGeom prst="rect">
                       <a:avLst/>
@@ -581,13 +2073,453 @@
       </w:r>
     </w:p>
     <w:p>
+      <w:r>
+        <w:rPr>
+          <w:sz w:val="18"/>
+        </w:rPr>
+        <w:t>En esta ejecución se observa que SeguroTest termina con 7 pruebas ejecutadas, sin errores ni fallos. Las zonas verdes muestran las partes del código cubiertas por los tests.</w:t>
+      </w:r>
+    </w:p>
+    <w:tbl>
+      <w:tblPr>
+        <w:tblStyle w:val="Tablaconcuadrcula"/>
+        <w:tblW w:w="0" w:type="auto"/>
+        <w:jc w:val="center"/>
+        <w:tblLook w:val="04A0" w:firstRow="1" w:lastRow="0" w:firstColumn="1" w:lastColumn="0" w:noHBand="0" w:noVBand="1"/>
+      </w:tblPr>
+      <w:tblGrid>
+        <w:gridCol w:w="2268"/>
+        <w:gridCol w:w="1814"/>
+        <w:gridCol w:w="2551"/>
+        <w:gridCol w:w="2665"/>
+      </w:tblGrid>
+      <w:tr>
+        <w:trPr>
+          <w:jc w:val="center"/>
+        </w:trPr>
+        <w:tc>
+          <w:tcPr>
+            <w:tcW w:w="2268" w:type="dxa"/>
+            <w:shd w:val="clear" w:color="auto" w:fill="D9EAF7"/>
+            <w:vAlign w:val="center"/>
+          </w:tcPr>
+          <w:p>
+            <w:r>
+              <w:rPr>
+                <w:b/>
+                <w:sz w:val="18"/>
+              </w:rPr>
+              <w:t>Clase de prueba</w:t>
+            </w:r>
+          </w:p>
+        </w:tc>
+        <w:tc>
+          <w:tcPr>
+            <w:tcW w:w="1814" w:type="dxa"/>
+            <w:shd w:val="clear" w:color="auto" w:fill="D9EAF7"/>
+            <w:vAlign w:val="center"/>
+          </w:tcPr>
+          <w:p>
+            <w:r>
+              <w:rPr>
+                <w:b/>
+                <w:sz w:val="18"/>
+              </w:rPr>
+              <w:t>Tipo de prueba</w:t>
+            </w:r>
+          </w:p>
+        </w:tc>
+        <w:tc>
+          <w:tcPr>
+            <w:tcW w:w="2551" w:type="dxa"/>
+            <w:shd w:val="clear" w:color="auto" w:fill="D9EAF7"/>
+            <w:vAlign w:val="center"/>
+          </w:tcPr>
+          <w:p>
+            <w:r>
+              <w:rPr>
+                <w:b/>
+                <w:sz w:val="18"/>
+              </w:rPr>
+              <w:t>Resultado en Eclipse</w:t>
+            </w:r>
+          </w:p>
+        </w:tc>
+        <w:tc>
+          <w:tcPr>
+            <w:tcW w:w="2665" w:type="dxa"/>
+            <w:shd w:val="clear" w:color="auto" w:fill="D9EAF7"/>
+            <w:vAlign w:val="center"/>
+          </w:tcPr>
+          <w:p>
+            <w:r>
+              <w:rPr>
+                <w:b/>
+                <w:sz w:val="18"/>
+              </w:rPr>
+              <w:t>Cobertura revisada</w:t>
+            </w:r>
+          </w:p>
+        </w:tc>
+      </w:tr>
+      <w:tr>
+        <w:trPr>
+          <w:jc w:val="center"/>
+        </w:trPr>
+        <w:tc>
+          <w:tcPr>
+            <w:tcW w:w="2268" w:type="dxa"/>
+            <w:vAlign w:val="center"/>
+          </w:tcPr>
+          <w:p>
+            <w:r>
+              <w:rPr>
+                <w:sz w:val="18"/>
+              </w:rPr>
+              <w:t>ClienteTest</w:t>
+            </w:r>
+          </w:p>
+        </w:tc>
+        <w:tc>
+          <w:tcPr>
+            <w:tcW w:w="1814" w:type="dxa"/>
+            <w:vAlign w:val="center"/>
+          </w:tcPr>
+          <w:p>
+            <w:r>
+              <w:rPr>
+                <w:sz w:val="18"/>
+              </w:rPr>
+              <w:t>Unitaria</w:t>
+            </w:r>
+          </w:p>
+        </w:tc>
+        <w:tc>
+          <w:tcPr>
+            <w:tcW w:w="2551" w:type="dxa"/>
+            <w:vAlign w:val="center"/>
+          </w:tcPr>
+          <w:p>
+            <w:r>
+              <w:rPr>
+                <w:sz w:val="18"/>
+              </w:rPr>
+              <w:t>3/3, sin errores ni fallos</w:t>
+            </w:r>
+          </w:p>
+        </w:tc>
+        <w:tc>
+          <w:tcPr>
+            <w:tcW w:w="2665" w:type="dxa"/>
+            <w:vAlign w:val="center"/>
+          </w:tcPr>
+          <w:p>
+            <w:r>
+              <w:rPr>
+                <w:sz w:val="18"/>
+              </w:rPr>
+              <w:t>Bucle sin seguros, bucle con varios seguros y rama de minusvalía</w:t>
+            </w:r>
+          </w:p>
+        </w:tc>
+      </w:tr>
+      <w:tr>
+        <w:trPr>
+          <w:jc w:val="center"/>
+        </w:trPr>
+        <w:tc>
+          <w:tcPr>
+            <w:tcW w:w="2268" w:type="dxa"/>
+            <w:vAlign w:val="center"/>
+          </w:tcPr>
+          <w:p>
+            <w:r>
+              <w:rPr>
+                <w:sz w:val="18"/>
+              </w:rPr>
+              <w:t>SeguroTest</w:t>
+            </w:r>
+          </w:p>
+        </w:tc>
+        <w:tc>
+          <w:tcPr>
+            <w:tcW w:w="1814" w:type="dxa"/>
+            <w:vAlign w:val="center"/>
+          </w:tcPr>
+          <w:p>
+            <w:r>
+              <w:rPr>
+                <w:sz w:val="18"/>
+              </w:rPr>
+              <w:t>Unitaria</w:t>
+            </w:r>
+          </w:p>
+        </w:tc>
+        <w:tc>
+          <w:tcPr>
+            <w:tcW w:w="2551" w:type="dxa"/>
+            <w:vAlign w:val="center"/>
+          </w:tcPr>
+          <w:p>
+            <w:r>
+              <w:rPr>
+                <w:sz w:val="18"/>
+              </w:rPr>
+              <w:t>7/7, sin errores ni fallos</w:t>
+            </w:r>
+          </w:p>
+        </w:tc>
+        <w:tc>
+          <w:tcPr>
+            <w:tcW w:w="2665" w:type="dxa"/>
+            <w:vAlign w:val="center"/>
+          </w:tcPr>
+          <w:p>
+            <w:r>
+              <w:rPr>
+                <w:sz w:val="18"/>
+              </w:rPr>
+              <w:t>Fecha futura, coberturas, potencia y descuento por antigüedad</w:t>
+            </w:r>
+          </w:p>
+        </w:tc>
+      </w:tr>
+      <w:tr>
+        <w:trPr>
+          <w:jc w:val="center"/>
+        </w:trPr>
+        <w:tc>
+          <w:tcPr>
+            <w:tcW w:w="2268" w:type="dxa"/>
+            <w:vAlign w:val="center"/>
+          </w:tcPr>
+          <w:p>
+            <w:r>
+              <w:rPr>
+                <w:sz w:val="18"/>
+              </w:rPr>
+              <w:t>VistaAgenteIT</w:t>
+            </w:r>
+          </w:p>
+        </w:tc>
+        <w:tc>
+          <w:tcPr>
+            <w:tcW w:w="1814" w:type="dxa"/>
+            <w:vAlign w:val="center"/>
+          </w:tcPr>
+          <w:p>
+            <w:r>
+              <w:rPr>
+                <w:sz w:val="18"/>
+              </w:rPr>
+              <w:t>Integración</w:t>
+            </w:r>
+          </w:p>
+        </w:tc>
+        <w:tc>
+          <w:tcPr>
+            <w:tcW w:w="2551" w:type="dxa"/>
+            <w:vAlign w:val="center"/>
+          </w:tcPr>
+          <w:p>
+            <w:r>
+              <w:rPr>
+                <w:sz w:val="18"/>
+              </w:rPr>
+              <w:t>Ejecución mediante mvn verify</w:t>
+            </w:r>
+          </w:p>
+        </w:tc>
+        <w:tc>
+          <w:tcPr>
+            <w:tcW w:w="2665" w:type="dxa"/>
+            <w:vAlign w:val="center"/>
+          </w:tcPr>
+          <w:p>
+            <w:r>
+              <w:rPr>
+                <w:sz w:val="18"/>
+              </w:rPr>
+              <w:t>Cliente encontrado, no encontrado y error BBDD</w:t>
+            </w:r>
+          </w:p>
+        </w:tc>
+      </w:tr>
+    </w:tbl>
+    <w:p/>
+    <w:p>
       <w:pPr>
-        <w:spacing w:after="120"/>
+        <w:spacing w:after="80" w:line="252" w:lineRule="auto"/>
       </w:pPr>
+      <w:r>
+        <w:t>Como las pruebas de caja negra ya cubrían las decisiones principales, no fue necesario añadir nuevos casos de caja blanca. Aun así, la revisión de cobertura sirvió para comprobar que no se había dejado sin probar ninguna rama importante de los métodos trabajados.</w:t>
+      </w:r>
     </w:p>
+    <w:p>
+      <w:pPr>
+        <w:spacing w:before="160" w:after="80"/>
+      </w:pPr>
+      <w:r>
+        <w:rPr>
+          <w:b/>
+          <w:sz w:val="28"/>
+        </w:rPr>
+        <w:t>8. Archivos de prueba incluidos</w:t>
+      </w:r>
+    </w:p>
+    <w:p>
+      <w:pPr>
+        <w:spacing w:after="80" w:line="252" w:lineRule="auto"/>
+      </w:pPr>
+      <w:r>
+        <w:t>Las pruebas unitarias están en el módulo SegurosCommon, dentro de ClienteTest y SeguroTest. La prueba de integración está en el módulo SegurosGUI, dentro de VistaAgenteIT.</w:t>
+      </w:r>
+    </w:p>
+    <w:p>
+      <w:pPr>
+        <w:spacing w:after="80" w:line="252" w:lineRule="auto"/>
+      </w:pPr>
+      <w:r>
+        <w:lastRenderedPageBreak/>
+        <w:t>También se usó una clase auxiliar para abrir VistaAgente de forma manual durante la depuración. Esa clase solo sirvió para comprobar visualmente la ventana y no sustituye a las pruebas automáticas.</w:t>
+      </w:r>
+    </w:p>
+    <w:p>
+      <w:pPr>
+        <w:spacing w:before="160" w:after="80"/>
+      </w:pPr>
+      <w:r>
+        <w:rPr>
+          <w:b/>
+          <w:sz w:val="28"/>
+        </w:rPr>
+        <w:t>9. Problemas encontrados</w:t>
+      </w:r>
+    </w:p>
+    <w:p>
+      <w:pPr>
+        <w:spacing w:after="80" w:line="252" w:lineRule="auto"/>
+      </w:pPr>
+      <w:r>
+        <w:t>El principal problema apareció con las pruebas de integración de VistaAgente. La aplicación funcionaba al probarla manualmente, pero al principio los tests con AssertJ Swing fallaban porque los campos de la ventana no se actualizaban como se esperaba.</w:t>
+      </w:r>
+    </w:p>
+    <w:p>
+      <w:pPr>
+        <w:spacing w:after="80" w:line="252" w:lineRule="auto"/>
+      </w:pPr>
+      <w:r>
+        <w:t>Primero se pensó que el fallo podía estar en VistaAgente, en GestionSeguros o en el DAO, pero al crear una prueba manual se comprobó que la búsqueda de clientes funcionaba bien. El problema estaba en la forma en la que el test interactuaba con la interfaz.</w:t>
+      </w:r>
+    </w:p>
+    <w:p>
+      <w:pPr>
+        <w:spacing w:after="80" w:line="252" w:lineRule="auto"/>
+      </w:pPr>
+      <w:r>
+        <w:t>La solución fue ejecutar las acciones de la interfaz en el hilo correcto de Swing usando GuiActionRunner. En vez de depender de enterText y click para esa parte, se accedió directamente a los componentes y se usaron setText y doClick. Con esto la interfaz quedó actualizada antes de hacer las comprobaciones y los tests dejaron de fallar.</w:t>
+      </w:r>
+    </w:p>
+    <w:p>
+      <w:pPr>
+        <w:spacing w:before="160" w:after="80"/>
+      </w:pPr>
+      <w:r>
+        <w:rPr>
+          <w:b/>
+          <w:sz w:val="28"/>
+        </w:rPr>
+        <w:t>10. Git</w:t>
+      </w:r>
+    </w:p>
+    <w:p>
+      <w:pPr>
+        <w:spacing w:after="80" w:line="252" w:lineRule="auto"/>
+      </w:pPr>
+      <w:r>
+        <w:t>La práctica se ha trabajado en una rama propia para practica5A. Después de comprobar que las pruebas funcionaban, se añadieron los cambios, se hizo commit y se subió la rama al repositorio remoto. Al cerrar la práctica, la rama se puede fusionar con main.</w:t>
+      </w:r>
+    </w:p>
+    <w:p>
+      <w:proofErr w:type="spellStart"/>
+      <w:r>
+        <w:t>Útimo</w:t>
+      </w:r>
+      <w:proofErr w:type="spellEnd"/>
+      <w:r>
+        <w:t xml:space="preserve"> commit </w:t>
+      </w:r>
+      <w:proofErr w:type="spellStart"/>
+      <w:r>
+        <w:t>mejorando</w:t>
+      </w:r>
+      <w:proofErr w:type="spellEnd"/>
+      <w:r>
+        <w:t xml:space="preserve"> </w:t>
+      </w:r>
+      <w:proofErr w:type="spellStart"/>
+      <w:r>
+        <w:t>el</w:t>
+      </w:r>
+      <w:proofErr w:type="spellEnd"/>
+      <w:r>
+        <w:t xml:space="preserve"> </w:t>
+      </w:r>
+      <w:proofErr w:type="spellStart"/>
+      <w:r>
+        <w:t>informe</w:t>
+      </w:r>
+      <w:proofErr w:type="spellEnd"/>
+      <w:r>
+        <w:t xml:space="preserve"> y </w:t>
+      </w:r>
+      <w:proofErr w:type="spellStart"/>
+      <w:r>
+        <w:t>comprobando</w:t>
+      </w:r>
+      <w:proofErr w:type="spellEnd"/>
+      <w:r>
+        <w:t xml:space="preserve"> </w:t>
+      </w:r>
+      <w:proofErr w:type="spellStart"/>
+      <w:r>
+        <w:t>que</w:t>
+      </w:r>
+      <w:proofErr w:type="spellEnd"/>
+      <w:r>
+        <w:t xml:space="preserve"> </w:t>
+      </w:r>
+      <w:proofErr w:type="spellStart"/>
+      <w:r>
+        <w:t>esté</w:t>
+      </w:r>
+      <w:proofErr w:type="spellEnd"/>
+      <w:r>
+        <w:t xml:space="preserve"> </w:t>
+      </w:r>
+      <w:proofErr w:type="spellStart"/>
+      <w:r>
+        <w:t>todo</w:t>
+      </w:r>
+      <w:proofErr w:type="spellEnd"/>
+      <w:r>
+        <w:t xml:space="preserve"> </w:t>
+      </w:r>
+      <w:proofErr w:type="spellStart"/>
+      <w:r>
+        <w:t>añadido</w:t>
+      </w:r>
+      <w:proofErr w:type="spellEnd"/>
+      <w:r>
+        <w:t>.</w:t>
+      </w:r>
+    </w:p>
+    <w:p/>
+    <w:p/>
+    <w:p/>
     <w:sectPr>
       <w:pgSz w:w="12240" w:h="15840"/>
-      <w:pgMar w:top="1417" w:right="1417" w:bottom="1417" w:left="1417" w:header="720" w:footer="720" w:gutter="0"/>
+      <w:pgMar w:top="907" w:right="1020" w:bottom="907" w:left="1020" w:header="720" w:footer="720" w:gutter="0"/>
       <w:cols w:space="720"/>
       <w:docGrid w:linePitch="360"/>
     </w:sectPr>
@@ -768,31 +2700,31 @@
       </w:rPr>
     </w:lvl>
   </w:abstractNum>
-  <w:num w:numId="1" w16cid:durableId="950085515">
+  <w:num w:numId="1" w16cid:durableId="1293438670">
     <w:abstractNumId w:val="8"/>
   </w:num>
-  <w:num w:numId="2" w16cid:durableId="1876966205">
+  <w:num w:numId="2" w16cid:durableId="1234967023">
     <w:abstractNumId w:val="6"/>
   </w:num>
-  <w:num w:numId="3" w16cid:durableId="847136356">
+  <w:num w:numId="3" w16cid:durableId="645085067">
     <w:abstractNumId w:val="5"/>
   </w:num>
-  <w:num w:numId="4" w16cid:durableId="1373187248">
+  <w:num w:numId="4" w16cid:durableId="1903907030">
     <w:abstractNumId w:val="4"/>
   </w:num>
-  <w:num w:numId="5" w16cid:durableId="2092972099">
+  <w:num w:numId="5" w16cid:durableId="1808738516">
     <w:abstractNumId w:val="7"/>
   </w:num>
-  <w:num w:numId="6" w16cid:durableId="1233810172">
+  <w:num w:numId="6" w16cid:durableId="1003625778">
     <w:abstractNumId w:val="3"/>
   </w:num>
-  <w:num w:numId="7" w16cid:durableId="775759466">
+  <w:num w:numId="7" w16cid:durableId="1222056654">
     <w:abstractNumId w:val="2"/>
   </w:num>
-  <w:num w:numId="8" w16cid:durableId="1031079173">
+  <w:num w:numId="8" w16cid:durableId="1136797907">
     <w:abstractNumId w:val="1"/>
   </w:num>
-  <w:num w:numId="9" w16cid:durableId="1398632670">
+  <w:num w:numId="9" w16cid:durableId="1055350077">
     <w:abstractNumId w:val="0"/>
   </w:num>
 </w:numbering>
@@ -1190,6 +3122,7 @@
     <w:rsid w:val="00FC693F"/>
     <w:rPr>
       <w:rFonts w:ascii="Calibri" w:eastAsia="Calibri" w:hAnsi="Calibri"/>
+      <w:sz w:val="21"/>
     </w:rPr>
   </w:style>
   <w:style w:type="paragraph" w:styleId="Ttulo1">
@@ -1235,7 +3168,7 @@
       <w:b/>
       <w:bCs/>
       <w:color w:val="4F81BD" w:themeColor="accent1"/>
-      <w:sz w:val="24"/>
+      <w:sz w:val="26"/>
       <w:szCs w:val="26"/>
     </w:rPr>
   </w:style>
@@ -1404,6 +3337,7 @@
   <w:style w:type="character" w:default="1" w:styleId="Fuentedeprrafopredeter">
     <w:name w:val="Default Paragraph Font"/>
     <w:uiPriority w:val="1"/>
+    <w:semiHidden/>
     <w:unhideWhenUsed/>
   </w:style>
   <w:style w:type="table" w:default="1" w:styleId="Tablanormal">
@@ -1540,11 +3474,10 @@
     </w:pPr>
     <w:rPr>
       <w:rFonts w:asciiTheme="majorHAnsi" w:eastAsiaTheme="majorEastAsia" w:hAnsiTheme="majorHAnsi" w:cstheme="majorBidi"/>
-      <w:b/>
       <w:color w:val="17365D" w:themeColor="text2" w:themeShade="BF"/>
       <w:spacing w:val="5"/>
       <w:kern w:val="28"/>
-      <w:sz w:val="36"/>
+      <w:sz w:val="52"/>
       <w:szCs w:val="52"/>
     </w:rPr>
   </w:style>

</xml_diff>